<commit_message>
Create Introduction to Object-Oriented Programming (OOP) Documentation with Java Examples  #36
</commit_message>
<xml_diff>
--- a/Chapter4/Chapter4.docx
+++ b/Chapter4/Chapter4.docx
@@ -80,6 +80,2406 @@
         <w:t xml:space="preserve"> 4.11 Class Design Hints</w:t>
       </w:r>
     </w:p>
+    <w:p/>
+    <w:p>
+      <w:pPr>
+        <w:rPr>
+          <w:b/>
+          <w:bCs/>
+        </w:rPr>
+      </w:pPr>
+      <w:r>
+        <w:rPr>
+          <w:b/>
+          <w:bCs/>
+        </w:rPr>
+        <w:t>4.1 Introduction to Object-Oriented Programming</w:t>
+      </w:r>
+    </w:p>
+    <w:p>
+      <w:r>
+        <w:t>Object-Oriented Programming (OOP) is a programming approach in which programs are built using objects that contain both data and the methods that operate on that data.</w:t>
+      </w:r>
+    </w:p>
+    <w:p>
+      <w:r>
+        <w:t xml:space="preserve">Before OOP, most programs were written using </w:t>
+      </w:r>
+      <w:r>
+        <w:rPr>
+          <w:b/>
+          <w:bCs/>
+        </w:rPr>
+        <w:t>procedural programming</w:t>
+      </w:r>
+      <w:r>
+        <w:t>, where the focus was on writing procedures or functions first and then designing data structures.</w:t>
+      </w:r>
+    </w:p>
+    <w:p>
+      <w:pPr>
+        <w:rPr>
+          <w:b/>
+          <w:bCs/>
+          <w:u w:val="single"/>
+        </w:rPr>
+      </w:pPr>
+      <w:r>
+        <w:rPr>
+          <w:b/>
+          <w:bCs/>
+          <w:u w:val="single"/>
+        </w:rPr>
+        <w:t>Procedural Programming</w:t>
+      </w:r>
+    </w:p>
+    <w:p>
+      <w:pPr>
+        <w:numPr>
+          <w:ilvl w:val="0"/>
+          <w:numId w:val="1"/>
+        </w:numPr>
+      </w:pPr>
+      <w:r>
+        <w:t xml:space="preserve">Focuses on functions and algorithms. </w:t>
+      </w:r>
+    </w:p>
+    <w:p>
+      <w:pPr>
+        <w:numPr>
+          <w:ilvl w:val="0"/>
+          <w:numId w:val="1"/>
+        </w:numPr>
+      </w:pPr>
+      <w:r>
+        <w:t xml:space="preserve">Data is often shared globally. </w:t>
+      </w:r>
+    </w:p>
+    <w:p>
+      <w:pPr>
+        <w:numPr>
+          <w:ilvl w:val="0"/>
+          <w:numId w:val="1"/>
+        </w:numPr>
+      </w:pPr>
+      <w:r>
+        <w:t xml:space="preserve">Large programs become difficult to manage. </w:t>
+      </w:r>
+    </w:p>
+    <w:p>
+      <w:pPr>
+        <w:numPr>
+          <w:ilvl w:val="0"/>
+          <w:numId w:val="1"/>
+        </w:numPr>
+      </w:pPr>
+      <w:r>
+        <w:t xml:space="preserve">Bugs are harder to locate because many functions may access the same data. </w:t>
+      </w:r>
+    </w:p>
+    <w:p>
+      <w:pPr>
+        <w:rPr>
+          <w:b/>
+          <w:bCs/>
+          <w:u w:val="single"/>
+        </w:rPr>
+      </w:pPr>
+      <w:r>
+        <w:rPr>
+          <w:b/>
+          <w:bCs/>
+          <w:u w:val="single"/>
+        </w:rPr>
+        <w:t>Object-Oriented Programming</w:t>
+      </w:r>
+    </w:p>
+    <w:p>
+      <w:pPr>
+        <w:numPr>
+          <w:ilvl w:val="0"/>
+          <w:numId w:val="2"/>
+        </w:numPr>
+      </w:pPr>
+      <w:r>
+        <w:t xml:space="preserve">Focuses on objects and their data. </w:t>
+      </w:r>
+    </w:p>
+    <w:p>
+      <w:pPr>
+        <w:numPr>
+          <w:ilvl w:val="0"/>
+          <w:numId w:val="2"/>
+        </w:numPr>
+      </w:pPr>
+      <w:r>
+        <w:t xml:space="preserve">Each object manages its own data. </w:t>
+      </w:r>
+    </w:p>
+    <w:p>
+      <w:pPr>
+        <w:numPr>
+          <w:ilvl w:val="0"/>
+          <w:numId w:val="2"/>
+        </w:numPr>
+      </w:pPr>
+      <w:r>
+        <w:t xml:space="preserve">Easier to maintain and debug. </w:t>
+      </w:r>
+    </w:p>
+    <w:p>
+      <w:pPr>
+        <w:numPr>
+          <w:ilvl w:val="0"/>
+          <w:numId w:val="2"/>
+        </w:numPr>
+      </w:pPr>
+      <w:r>
+        <w:t>Encourages code reuse and modularity.</w:t>
+      </w:r>
+    </w:p>
+    <w:p>
+      <w:pPr>
+        <w:rPr>
+          <w:b/>
+          <w:bCs/>
+        </w:rPr>
+      </w:pPr>
+      <w:r>
+        <w:rPr>
+          <w:b/>
+          <w:bCs/>
+        </w:rPr>
+        <w:t>Advantages of OOP</w:t>
+      </w:r>
+    </w:p>
+    <w:p>
+      <w:pPr>
+        <w:numPr>
+          <w:ilvl w:val="0"/>
+          <w:numId w:val="3"/>
+        </w:numPr>
+      </w:pPr>
+      <w:r>
+        <w:t xml:space="preserve">Improves code organization. </w:t>
+      </w:r>
+    </w:p>
+    <w:p>
+      <w:pPr>
+        <w:numPr>
+          <w:ilvl w:val="0"/>
+          <w:numId w:val="3"/>
+        </w:numPr>
+      </w:pPr>
+      <w:r>
+        <w:t xml:space="preserve">Encourages code reuse. </w:t>
+      </w:r>
+    </w:p>
+    <w:p>
+      <w:pPr>
+        <w:numPr>
+          <w:ilvl w:val="0"/>
+          <w:numId w:val="3"/>
+        </w:numPr>
+      </w:pPr>
+      <w:r>
+        <w:t xml:space="preserve">Simplifies debugging. </w:t>
+      </w:r>
+    </w:p>
+    <w:p>
+      <w:pPr>
+        <w:numPr>
+          <w:ilvl w:val="0"/>
+          <w:numId w:val="3"/>
+        </w:numPr>
+      </w:pPr>
+      <w:r>
+        <w:t xml:space="preserve">Makes software easier to maintain. </w:t>
+      </w:r>
+    </w:p>
+    <w:p>
+      <w:pPr>
+        <w:numPr>
+          <w:ilvl w:val="0"/>
+          <w:numId w:val="3"/>
+        </w:numPr>
+      </w:pPr>
+      <w:r>
+        <w:lastRenderedPageBreak/>
+        <w:t xml:space="preserve">Reduces code duplication. </w:t>
+      </w:r>
+    </w:p>
+    <w:p>
+      <w:pPr>
+        <w:numPr>
+          <w:ilvl w:val="0"/>
+          <w:numId w:val="3"/>
+        </w:numPr>
+      </w:pPr>
+      <w:r>
+        <w:t xml:space="preserve">Protects data through encapsulation. </w:t>
+      </w:r>
+    </w:p>
+    <w:p>
+      <w:pPr>
+        <w:numPr>
+          <w:ilvl w:val="0"/>
+          <w:numId w:val="3"/>
+        </w:numPr>
+      </w:pPr>
+      <w:r>
+        <w:t xml:space="preserve">Makes teamwork easier because classes are modular. </w:t>
+      </w:r>
+    </w:p>
+    <w:p>
+      <w:pPr>
+        <w:numPr>
+          <w:ilvl w:val="0"/>
+          <w:numId w:val="3"/>
+        </w:numPr>
+      </w:pPr>
+      <w:r>
+        <w:t xml:space="preserve">Suitable for large-scale applications. </w:t>
+      </w:r>
+    </w:p>
+    <w:p/>
+    <w:p>
+      <w:pPr>
+        <w:rPr>
+          <w:b/>
+          <w:bCs/>
+          <w:u w:val="single"/>
+        </w:rPr>
+      </w:pPr>
+      <w:r>
+        <w:rPr>
+          <w:b/>
+          <w:bCs/>
+          <w:u w:val="single"/>
+        </w:rPr>
+        <w:t>Classes</w:t>
+      </w:r>
+    </w:p>
+    <w:p>
+      <w:r>
+        <w:t xml:space="preserve">A </w:t>
+      </w:r>
+      <w:r>
+        <w:rPr>
+          <w:b/>
+          <w:bCs/>
+        </w:rPr>
+        <w:t>class</w:t>
+      </w:r>
+      <w:r>
+        <w:t xml:space="preserve"> is a blueprint or template used to create objects. It defines the properties (fields) and </w:t>
+      </w:r>
+      <w:r>
+        <w:t>behaviours</w:t>
+      </w:r>
+      <w:r>
+        <w:t xml:space="preserve"> (methods) that objects created from the class will have.</w:t>
+      </w:r>
+    </w:p>
+    <w:p>
+      <w:r>
+        <w:rPr>
+          <w:b/>
+          <w:bCs/>
+        </w:rPr>
+        <w:t>Identifying Classes</w:t>
+      </w:r>
+      <w:r>
+        <w:rPr>
+          <w:b/>
+          <w:bCs/>
+        </w:rPr>
+        <w:t xml:space="preserve">: </w:t>
+      </w:r>
+      <w:r>
+        <w:t>A simple rule for identifying classes is:</w:t>
+      </w:r>
+    </w:p>
+    <w:p>
+      <w:pPr>
+        <w:rPr>
+          <w:i/>
+          <w:iCs/>
+          <w:u w:val="single"/>
+        </w:rPr>
+      </w:pPr>
+      <w:r>
+        <w:rPr>
+          <w:i/>
+          <w:iCs/>
+          <w:u w:val="single"/>
+        </w:rPr>
+        <w:t xml:space="preserve">Nouns </w:t>
+      </w:r>
+      <w:r>
+        <w:rPr>
+          <w:i/>
+          <w:iCs/>
+          <w:u w:val="single"/>
+        </w:rPr>
+        <w:t>(are)</w:t>
+      </w:r>
+      <w:r>
+        <w:rPr>
+          <w:i/>
+          <w:iCs/>
+          <w:u w:val="single"/>
+        </w:rPr>
+        <w:t xml:space="preserve"> Classes</w:t>
+      </w:r>
+      <w:r>
+        <w:rPr>
+          <w:i/>
+          <w:iCs/>
+          <w:u w:val="single"/>
+        </w:rPr>
+        <w:t xml:space="preserve"> like </w:t>
+      </w:r>
+      <w:r>
+        <w:rPr>
+          <w:i/>
+          <w:iCs/>
+          <w:u w:val="single"/>
+        </w:rPr>
+        <w:t>Student</w:t>
+      </w:r>
+      <w:r>
+        <w:rPr>
+          <w:i/>
+          <w:iCs/>
+          <w:u w:val="single"/>
+        </w:rPr>
+        <w:t xml:space="preserve">, </w:t>
+      </w:r>
+      <w:r>
+        <w:rPr>
+          <w:i/>
+          <w:iCs/>
+          <w:u w:val="single"/>
+        </w:rPr>
+        <w:t>Teacher</w:t>
+      </w:r>
+      <w:r>
+        <w:rPr>
+          <w:i/>
+          <w:iCs/>
+          <w:u w:val="single"/>
+        </w:rPr>
+        <w:t xml:space="preserve"> or </w:t>
+      </w:r>
+      <w:r>
+        <w:rPr>
+          <w:i/>
+          <w:iCs/>
+          <w:u w:val="single"/>
+        </w:rPr>
+        <w:t>Book</w:t>
+      </w:r>
+    </w:p>
+    <w:p>
+      <w:pPr>
+        <w:rPr>
+          <w:i/>
+          <w:iCs/>
+          <w:u w:val="single"/>
+        </w:rPr>
+      </w:pPr>
+      <w:r>
+        <w:rPr>
+          <w:i/>
+          <w:iCs/>
+          <w:u w:val="single"/>
+        </w:rPr>
+        <w:t xml:space="preserve">Verbs </w:t>
+      </w:r>
+      <w:r>
+        <w:rPr>
+          <w:i/>
+          <w:iCs/>
+          <w:u w:val="single"/>
+        </w:rPr>
+        <w:t>(are)</w:t>
+      </w:r>
+      <w:r>
+        <w:rPr>
+          <w:i/>
+          <w:iCs/>
+          <w:u w:val="single"/>
+        </w:rPr>
+        <w:t xml:space="preserve"> Methods</w:t>
+      </w:r>
+      <w:r>
+        <w:rPr>
+          <w:i/>
+          <w:iCs/>
+          <w:u w:val="single"/>
+        </w:rPr>
+        <w:t xml:space="preserve"> like </w:t>
+      </w:r>
+      <w:r>
+        <w:rPr>
+          <w:i/>
+          <w:iCs/>
+          <w:u w:val="single"/>
+        </w:rPr>
+        <w:t>Add</w:t>
+      </w:r>
+      <w:r>
+        <w:rPr>
+          <w:i/>
+          <w:iCs/>
+          <w:u w:val="single"/>
+        </w:rPr>
+        <w:t xml:space="preserve">, </w:t>
+      </w:r>
+      <w:r>
+        <w:rPr>
+          <w:i/>
+          <w:iCs/>
+          <w:u w:val="single"/>
+        </w:rPr>
+        <w:t>Delete</w:t>
+      </w:r>
+      <w:r>
+        <w:rPr>
+          <w:i/>
+          <w:iCs/>
+          <w:u w:val="single"/>
+        </w:rPr>
+        <w:t xml:space="preserve"> </w:t>
+      </w:r>
+      <w:r>
+        <w:rPr>
+          <w:i/>
+          <w:iCs/>
+          <w:u w:val="single"/>
+        </w:rPr>
+        <w:t>or Pay</w:t>
+      </w:r>
+      <w:r>
+        <w:rPr>
+          <w:i/>
+          <w:iCs/>
+          <w:u w:val="single"/>
+        </w:rPr>
+        <w:t xml:space="preserve"> </w:t>
+      </w:r>
+    </w:p>
+    <w:p>
+      <w:pPr>
+        <w:jc w:val="center"/>
+      </w:pPr>
+      <w:r>
+        <w:rPr>
+          <w:noProof/>
+        </w:rPr>
+        <w:drawing>
+          <wp:inline distT="0" distB="0" distL="0" distR="0" wp14:anchorId="69148C4F" wp14:editId="5457A125">
+            <wp:extent cx="5962650" cy="2295525"/>
+            <wp:effectExtent l="0" t="0" r="0" b="9525"/>
+            <wp:docPr id="927340338" name="Picture 1"/>
+            <wp:cNvGraphicFramePr>
+              <a:graphicFrameLocks xmlns:a="http://schemas.openxmlformats.org/drawingml/2006/main" noChangeAspect="1"/>
+            </wp:cNvGraphicFramePr>
+            <a:graphic xmlns:a="http://schemas.openxmlformats.org/drawingml/2006/main">
+              <a:graphicData uri="http://schemas.openxmlformats.org/drawingml/2006/picture">
+                <pic:pic xmlns:pic="http://schemas.openxmlformats.org/drawingml/2006/picture">
+                  <pic:nvPicPr>
+                    <pic:cNvPr id="927340338" name=""/>
+                    <pic:cNvPicPr/>
+                  </pic:nvPicPr>
+                  <pic:blipFill>
+                    <a:blip r:embed="rId5"/>
+                    <a:stretch>
+                      <a:fillRect/>
+                    </a:stretch>
+                  </pic:blipFill>
+                  <pic:spPr>
+                    <a:xfrm>
+                      <a:off x="0" y="0"/>
+                      <a:ext cx="5962650" cy="2295525"/>
+                    </a:xfrm>
+                    <a:prstGeom prst="rect">
+                      <a:avLst/>
+                    </a:prstGeom>
+                  </pic:spPr>
+                </pic:pic>
+              </a:graphicData>
+            </a:graphic>
+          </wp:inline>
+        </w:drawing>
+      </w:r>
+    </w:p>
+    <w:p>
+      <w:pPr>
+        <w:rPr>
+          <w:b/>
+          <w:bCs/>
+        </w:rPr>
+      </w:pPr>
+      <w:r>
+        <w:rPr>
+          <w:b/>
+          <w:bCs/>
+        </w:rPr>
+        <w:t>Relationships Between Classes</w:t>
+      </w:r>
+    </w:p>
+    <w:p>
+      <w:r>
+        <w:rPr>
+          <w:b/>
+          <w:bCs/>
+          <w:u w:val="single"/>
+        </w:rPr>
+        <w:t>Dependency ("Uses-a")</w:t>
+      </w:r>
+      <w:r>
+        <w:rPr>
+          <w:b/>
+          <w:bCs/>
+          <w:u w:val="single"/>
+        </w:rPr>
+        <w:t>:</w:t>
+      </w:r>
+      <w:r>
+        <w:t xml:space="preserve"> </w:t>
+      </w:r>
+      <w:r>
+        <w:t>One class depends on another if it uses its objects.</w:t>
+      </w:r>
+      <w:r>
+        <w:t xml:space="preserve"> For example, </w:t>
+      </w:r>
+      <w:r>
+        <w:t>The Order class uses the Payment class to complete transactions.</w:t>
+      </w:r>
+      <w:r>
+        <w:t xml:space="preserve"> It is </w:t>
+      </w:r>
+      <w:r>
+        <w:t>Temporary relationship</w:t>
+      </w:r>
+      <w:r>
+        <w:t xml:space="preserve">, </w:t>
+      </w:r>
+      <w:r>
+        <w:t>Loose coupling</w:t>
+      </w:r>
+      <w:r>
+        <w:t xml:space="preserve"> and </w:t>
+      </w:r>
+      <w:r>
+        <w:t>One class calls another</w:t>
+      </w:r>
+      <w:r>
+        <w:t>.</w:t>
+      </w:r>
+    </w:p>
+    <w:p/>
+    <w:p>
+      <w:r>
+        <w:rPr>
+          <w:b/>
+          <w:bCs/>
+          <w:u w:val="single"/>
+        </w:rPr>
+        <w:t>Aggregation ("Has-a")</w:t>
+      </w:r>
+      <w:r>
+        <w:rPr>
+          <w:b/>
+          <w:bCs/>
+          <w:u w:val="single"/>
+        </w:rPr>
+        <w:t>:</w:t>
+      </w:r>
+      <w:r>
+        <w:t xml:space="preserve"> </w:t>
+      </w:r>
+      <w:r>
+        <w:t>Aggregation means one object contains another object.</w:t>
+      </w:r>
+      <w:r>
+        <w:t xml:space="preserve"> For example, the </w:t>
+      </w:r>
+      <w:r>
+        <w:t>Department</w:t>
+      </w:r>
+      <w:r>
+        <w:t xml:space="preserve"> </w:t>
+      </w:r>
+      <w:r>
+        <w:t>contains</w:t>
+      </w:r>
+      <w:r>
+        <w:t xml:space="preserve"> </w:t>
+      </w:r>
+      <w:r>
+        <w:t>Employees</w:t>
+      </w:r>
+      <w:r>
+        <w:t xml:space="preserve"> </w:t>
+      </w:r>
+    </w:p>
+    <w:p/>
+    <w:p>
+      <w:r>
+        <w:rPr>
+          <w:b/>
+          <w:bCs/>
+          <w:u w:val="single"/>
+        </w:rPr>
+        <w:t>Inheritance ("Is-a")</w:t>
+      </w:r>
+      <w:r>
+        <w:rPr>
+          <w:b/>
+          <w:bCs/>
+          <w:u w:val="single"/>
+        </w:rPr>
+        <w:t>:</w:t>
+      </w:r>
+      <w:r>
+        <w:t xml:space="preserve">  </w:t>
+      </w:r>
+      <w:r>
+        <w:t xml:space="preserve">It is a mechanism that allows a new class (called the child class or subclass) to acquire the properties (fields) and </w:t>
+      </w:r>
+      <w:r>
+        <w:t>behaviours</w:t>
+      </w:r>
+      <w:r>
+        <w:t xml:space="preserve"> (methods) of an existing class (called the parent class or superclass).</w:t>
+      </w:r>
+      <w:r>
+        <w:t xml:space="preserve"> For </w:t>
+      </w:r>
+      <w:r>
+        <w:t>example,</w:t>
+      </w:r>
+      <w:r>
+        <w:t xml:space="preserve"> </w:t>
+      </w:r>
+      <w:r>
+        <w:t>Dog inherits Animal's features and adds its own.</w:t>
+      </w:r>
+    </w:p>
+    <w:p/>
+    <w:p>
+      <w:pPr>
+        <w:rPr>
+          <w:b/>
+          <w:bCs/>
+          <w:u w:val="single"/>
+        </w:rPr>
+      </w:pPr>
+      <w:r>
+        <w:rPr>
+          <w:b/>
+          <w:bCs/>
+          <w:u w:val="single"/>
+        </w:rPr>
+        <w:t>Objects</w:t>
+      </w:r>
+    </w:p>
+    <w:p>
+      <w:r>
+        <w:t xml:space="preserve">An </w:t>
+      </w:r>
+      <w:r>
+        <w:rPr>
+          <w:b/>
+          <w:bCs/>
+        </w:rPr>
+        <w:t>object</w:t>
+      </w:r>
+      <w:r>
+        <w:t xml:space="preserve"> is an instance of a class.</w:t>
+      </w:r>
+      <w:r>
+        <w:t xml:space="preserve"> </w:t>
+      </w:r>
+      <w:r>
+        <w:t>It contains:</w:t>
+      </w:r>
+      <w:r>
+        <w:t xml:space="preserve"> </w:t>
+      </w:r>
+      <w:r>
+        <w:t>Data (state)</w:t>
+      </w:r>
+      <w:r>
+        <w:t xml:space="preserve">, </w:t>
+      </w:r>
+      <w:r>
+        <w:t>Methods (</w:t>
+      </w:r>
+      <w:r>
+        <w:t>behaviour</w:t>
+      </w:r>
+      <w:r>
+        <w:t>)</w:t>
+      </w:r>
+      <w:r>
+        <w:t xml:space="preserve"> and </w:t>
+      </w:r>
+      <w:r>
+        <w:t>Identity</w:t>
+      </w:r>
+    </w:p>
+    <w:p>
+      <w:r>
+        <w:t>Every object has three important characteristics</w:t>
+      </w:r>
+      <w:r>
+        <w:t>:</w:t>
+      </w:r>
+    </w:p>
+    <w:p>
+      <w:r>
+        <w:rPr>
+          <w:b/>
+          <w:bCs/>
+        </w:rPr>
+        <w:t>State:</w:t>
+      </w:r>
+      <w:r>
+        <w:t xml:space="preserve"> </w:t>
+      </w:r>
+      <w:r>
+        <w:t xml:space="preserve">The </w:t>
+      </w:r>
+      <w:r>
+        <w:rPr>
+          <w:b/>
+          <w:bCs/>
+        </w:rPr>
+        <w:t>state</w:t>
+      </w:r>
+      <w:r>
+        <w:t xml:space="preserve"> of an object represents the current values of its attributes.</w:t>
+      </w:r>
+    </w:p>
+    <w:p>
+      <w:r>
+        <w:rPr>
+          <w:b/>
+          <w:bCs/>
+        </w:rPr>
+        <w:t>Behaviour:</w:t>
+      </w:r>
+      <w:r>
+        <w:t xml:space="preserve"> </w:t>
+      </w:r>
+      <w:r>
+        <w:t>Behaviour</w:t>
+      </w:r>
+      <w:r>
+        <w:t xml:space="preserve"> describes what an object can do</w:t>
+      </w:r>
+      <w:r>
+        <w:t xml:space="preserve"> and they are </w:t>
+      </w:r>
+      <w:r>
+        <w:t>represented by methods.</w:t>
+      </w:r>
+    </w:p>
+    <w:p>
+      <w:r>
+        <w:rPr>
+          <w:b/>
+          <w:bCs/>
+        </w:rPr>
+        <w:lastRenderedPageBreak/>
+        <w:t>Identity</w:t>
+      </w:r>
+      <w:r>
+        <w:rPr>
+          <w:b/>
+          <w:bCs/>
+        </w:rPr>
+        <w:t>:</w:t>
+      </w:r>
+      <w:r>
+        <w:t xml:space="preserve"> </w:t>
+      </w:r>
+      <w:r>
+        <w:t>Identity makes one object different from another even if both have the same state.</w:t>
+      </w:r>
+      <w:r>
+        <w:t xml:space="preserve"> For </w:t>
+      </w:r>
+      <w:r>
+        <w:t>Example</w:t>
+      </w:r>
+      <w:r>
+        <w:t xml:space="preserve">, </w:t>
+      </w:r>
+      <w:r>
+        <w:t>two</w:t>
+      </w:r>
+      <w:r>
+        <w:t xml:space="preserve"> students may have</w:t>
+      </w:r>
+      <w:r>
+        <w:t xml:space="preserve"> </w:t>
+      </w:r>
+      <w:r>
+        <w:rPr>
+          <w:u w:val="single"/>
+        </w:rPr>
+        <w:t>Same name</w:t>
+      </w:r>
+      <w:r>
+        <w:rPr>
+          <w:u w:val="single"/>
+        </w:rPr>
+        <w:t xml:space="preserve"> </w:t>
+      </w:r>
+      <w:r>
+        <w:t xml:space="preserve">and </w:t>
+      </w:r>
+      <w:r>
+        <w:rPr>
+          <w:u w:val="single"/>
+        </w:rPr>
+        <w:t xml:space="preserve">Same </w:t>
+      </w:r>
+      <w:r>
+        <w:rPr>
+          <w:u w:val="single"/>
+        </w:rPr>
+        <w:t>age</w:t>
+      </w:r>
+      <w:r>
+        <w:rPr>
+          <w:u w:val="single"/>
+        </w:rPr>
+        <w:t xml:space="preserve"> </w:t>
+      </w:r>
+      <w:r>
+        <w:rPr>
+          <w:u w:val="single"/>
+        </w:rPr>
+        <w:t>but</w:t>
+      </w:r>
+      <w:r>
+        <w:rPr>
+          <w:u w:val="single"/>
+        </w:rPr>
+        <w:t xml:space="preserve"> </w:t>
+      </w:r>
+      <w:r>
+        <w:t>they are still different students because each has a unique identity (such as a student ID).</w:t>
+      </w:r>
+    </w:p>
+    <w:p>
+      <w:pPr>
+        <w:rPr>
+          <w:b/>
+          <w:bCs/>
+        </w:rPr>
+      </w:pPr>
+      <w:r>
+        <w:rPr>
+          <w:b/>
+          <w:bCs/>
+        </w:rPr>
+        <w:t>key concept in</w:t>
+      </w:r>
+      <w:r>
+        <w:rPr>
+          <w:b/>
+          <w:bCs/>
+        </w:rPr>
+        <w:t xml:space="preserve"> </w:t>
+      </w:r>
+      <w:r>
+        <w:rPr>
+          <w:b/>
+          <w:bCs/>
+        </w:rPr>
+        <w:t xml:space="preserve">working with </w:t>
+      </w:r>
+      <w:r>
+        <w:rPr>
+          <w:b/>
+          <w:bCs/>
+        </w:rPr>
+        <w:t>objects</w:t>
+      </w:r>
+      <w:r>
+        <w:rPr>
+          <w:b/>
+          <w:bCs/>
+        </w:rPr>
+        <w:t xml:space="preserve">: is </w:t>
+      </w:r>
+      <w:r>
+        <w:rPr>
+          <w:b/>
+          <w:bCs/>
+        </w:rPr>
+        <w:t>Encapsulation</w:t>
+      </w:r>
+    </w:p>
+    <w:p>
+      <w:r>
+        <w:rPr>
+          <w:b/>
+          <w:bCs/>
+        </w:rPr>
+        <w:t>Encapsulation</w:t>
+      </w:r>
+      <w:r>
+        <w:rPr>
+          <w:b/>
+          <w:bCs/>
+        </w:rPr>
+        <w:t xml:space="preserve"> (</w:t>
+      </w:r>
+      <w:r>
+        <w:rPr>
+          <w:b/>
+          <w:bCs/>
+        </w:rPr>
+        <w:t xml:space="preserve">sometimes called </w:t>
+      </w:r>
+      <w:r>
+        <w:rPr>
+          <w:b/>
+          <w:bCs/>
+          <w:i/>
+          <w:iCs/>
+        </w:rPr>
+        <w:t>information hiding</w:t>
+      </w:r>
+      <w:r>
+        <w:rPr>
+          <w:b/>
+          <w:bCs/>
+        </w:rPr>
+        <w:t>)</w:t>
+      </w:r>
+      <w:r>
+        <w:rPr>
+          <w:b/>
+          <w:bCs/>
+        </w:rPr>
+        <w:t xml:space="preserve">: </w:t>
+      </w:r>
+      <w:r>
+        <w:t>is the process of combining data and methods into one unit (a class) while hiding the internal implementation details from outside access. Data is accessed through methods instead of directly.</w:t>
+      </w:r>
+    </w:p>
+    <w:p>
+      <w:r>
+        <w:rPr>
+          <w:b/>
+          <w:bCs/>
+        </w:rPr>
+        <w:t>Information Hiding</w:t>
+      </w:r>
+      <w:r>
+        <w:rPr>
+          <w:b/>
+          <w:bCs/>
+        </w:rPr>
+        <w:t>:</w:t>
+      </w:r>
+      <w:r>
+        <w:t xml:space="preserve"> </w:t>
+      </w:r>
+      <w:r>
+        <w:t>Information hiding means keeping implementation details private and exposing only what users need.</w:t>
+      </w:r>
+    </w:p>
+    <w:p>
+      <w:pPr>
+        <w:rPr>
+          <w:i/>
+          <w:iCs/>
+        </w:rPr>
+      </w:pPr>
+      <w:r>
+        <w:rPr>
+          <w:i/>
+          <w:iCs/>
+        </w:rPr>
+        <w:t xml:space="preserve">Encapsulation bundles </w:t>
+      </w:r>
+      <w:r>
+        <w:rPr>
+          <w:b/>
+          <w:bCs/>
+          <w:i/>
+          <w:iCs/>
+        </w:rPr>
+        <w:t>data and methods together</w:t>
+      </w:r>
+      <w:r>
+        <w:rPr>
+          <w:i/>
+          <w:iCs/>
+        </w:rPr>
+        <w:t xml:space="preserve"> inside a class. Information hiding is the design principle of </w:t>
+      </w:r>
+      <w:r>
+        <w:rPr>
+          <w:b/>
+          <w:bCs/>
+          <w:i/>
+          <w:iCs/>
+        </w:rPr>
+        <w:t>preventing outside code from seeing or modifying implementation details</w:t>
+      </w:r>
+      <w:r>
+        <w:rPr>
+          <w:i/>
+          <w:iCs/>
+        </w:rPr>
+        <w:t>. In other words, encapsulation is often the technique used to achieve information hiding.</w:t>
+      </w:r>
+    </w:p>
+    <w:p>
+      <w:r>
+        <w:rPr>
+          <w:b/>
+          <w:bCs/>
+        </w:rPr>
+        <w:t>Instance Fields</w:t>
+      </w:r>
+      <w:r>
+        <w:rPr>
+          <w:b/>
+          <w:bCs/>
+        </w:rPr>
+        <w:t>:</w:t>
+      </w:r>
+      <w:r>
+        <w:t xml:space="preserve"> </w:t>
+      </w:r>
+      <w:r>
+        <w:t>Instance fields are variables that belong to an object.</w:t>
+      </w:r>
+      <w:r>
+        <w:t xml:space="preserve"> </w:t>
+      </w:r>
+      <w:r>
+        <w:t>so,</w:t>
+      </w:r>
+      <w:r>
+        <w:t xml:space="preserve"> when we say int name or age these are </w:t>
+      </w:r>
+      <w:r>
+        <w:t>instance fields.</w:t>
+      </w:r>
+    </w:p>
+    <w:p>
+      <w:pPr>
+        <w:jc w:val="center"/>
+      </w:pPr>
+      <w:r>
+        <w:rPr>
+          <w:noProof/>
+        </w:rPr>
+        <w:drawing>
+          <wp:inline distT="0" distB="0" distL="0" distR="0" wp14:anchorId="4310AC88" wp14:editId="4B4BAE1B">
+            <wp:extent cx="6457950" cy="2295525"/>
+            <wp:effectExtent l="0" t="0" r="0" b="9525"/>
+            <wp:docPr id="133518283" name="Picture 1"/>
+            <wp:cNvGraphicFramePr>
+              <a:graphicFrameLocks xmlns:a="http://schemas.openxmlformats.org/drawingml/2006/main" noChangeAspect="1"/>
+            </wp:cNvGraphicFramePr>
+            <a:graphic xmlns:a="http://schemas.openxmlformats.org/drawingml/2006/main">
+              <a:graphicData uri="http://schemas.openxmlformats.org/drawingml/2006/picture">
+                <pic:pic xmlns:pic="http://schemas.openxmlformats.org/drawingml/2006/picture">
+                  <pic:nvPicPr>
+                    <pic:cNvPr id="133518283" name=""/>
+                    <pic:cNvPicPr/>
+                  </pic:nvPicPr>
+                  <pic:blipFill>
+                    <a:blip r:embed="rId6"/>
+                    <a:stretch>
+                      <a:fillRect/>
+                    </a:stretch>
+                  </pic:blipFill>
+                  <pic:spPr>
+                    <a:xfrm>
+                      <a:off x="0" y="0"/>
+                      <a:ext cx="6457950" cy="2295525"/>
+                    </a:xfrm>
+                    <a:prstGeom prst="rect">
+                      <a:avLst/>
+                    </a:prstGeom>
+                  </pic:spPr>
+                </pic:pic>
+              </a:graphicData>
+            </a:graphic>
+          </wp:inline>
+        </w:drawing>
+      </w:r>
+    </w:p>
+    <w:p>
+      <w:r>
+        <w:rPr>
+          <w:b/>
+          <w:bCs/>
+        </w:rPr>
+        <w:t>Methods</w:t>
+      </w:r>
+      <w:r>
+        <w:rPr>
+          <w:b/>
+          <w:bCs/>
+        </w:rPr>
+        <w:t xml:space="preserve">: </w:t>
+      </w:r>
+      <w:r>
+        <w:t xml:space="preserve">are functions inside a class that define the </w:t>
+      </w:r>
+      <w:r>
+        <w:t>behaviour</w:t>
+      </w:r>
+      <w:r>
+        <w:t xml:space="preserve"> of objects.</w:t>
+      </w:r>
+    </w:p>
+    <w:p>
+      <w:pPr>
+        <w:jc w:val="center"/>
+      </w:pPr>
+      <w:r>
+        <w:rPr>
+          <w:noProof/>
+        </w:rPr>
+        <w:drawing>
+          <wp:inline distT="0" distB="0" distL="0" distR="0" wp14:anchorId="0F2FF0D9" wp14:editId="3D37806F">
+            <wp:extent cx="6419850" cy="2266950"/>
+            <wp:effectExtent l="0" t="0" r="0" b="0"/>
+            <wp:docPr id="634312896" name="Picture 1"/>
+            <wp:cNvGraphicFramePr>
+              <a:graphicFrameLocks xmlns:a="http://schemas.openxmlformats.org/drawingml/2006/main" noChangeAspect="1"/>
+            </wp:cNvGraphicFramePr>
+            <a:graphic xmlns:a="http://schemas.openxmlformats.org/drawingml/2006/main">
+              <a:graphicData uri="http://schemas.openxmlformats.org/drawingml/2006/picture">
+                <pic:pic xmlns:pic="http://schemas.openxmlformats.org/drawingml/2006/picture">
+                  <pic:nvPicPr>
+                    <pic:cNvPr id="634312896" name=""/>
+                    <pic:cNvPicPr/>
+                  </pic:nvPicPr>
+                  <pic:blipFill>
+                    <a:blip r:embed="rId7"/>
+                    <a:stretch>
+                      <a:fillRect/>
+                    </a:stretch>
+                  </pic:blipFill>
+                  <pic:spPr>
+                    <a:xfrm>
+                      <a:off x="0" y="0"/>
+                      <a:ext cx="6419850" cy="2266950"/>
+                    </a:xfrm>
+                    <a:prstGeom prst="rect">
+                      <a:avLst/>
+                    </a:prstGeom>
+                  </pic:spPr>
+                </pic:pic>
+              </a:graphicData>
+            </a:graphic>
+          </wp:inline>
+        </w:drawing>
+      </w:r>
+    </w:p>
+    <w:p>
+      <w:pPr>
+        <w:rPr>
+          <w:b/>
+          <w:bCs/>
+        </w:rPr>
+      </w:pPr>
+      <w:r>
+        <w:t xml:space="preserve">An </w:t>
+      </w:r>
+      <w:r>
+        <w:rPr>
+          <w:b/>
+          <w:bCs/>
+        </w:rPr>
+        <w:t>instance</w:t>
+      </w:r>
+      <w:r>
+        <w:t xml:space="preserve"> is another name for an object created from a class.</w:t>
+      </w:r>
+      <w:r>
+        <w:t xml:space="preserve"> </w:t>
+      </w:r>
+      <w:r>
+        <w:rPr>
+          <w:lang w:val="en-US"/>
+        </w:rPr>
+        <w:t xml:space="preserve">so, keep in mind when you declare a class which is a description of your object then create an object by typing </w:t>
+      </w:r>
+      <w:r>
+        <w:rPr>
+          <w:b/>
+          <w:bCs/>
+        </w:rPr>
+        <w:t xml:space="preserve">Student s1 = new </w:t>
+      </w:r>
+      <w:r>
+        <w:rPr>
+          <w:b/>
+          <w:bCs/>
+        </w:rPr>
+        <w:t>Student ();</w:t>
+      </w:r>
+      <w:r>
+        <w:rPr>
+          <w:b/>
+          <w:bCs/>
+        </w:rPr>
+        <w:t xml:space="preserve"> </w:t>
+      </w:r>
+      <w:proofErr w:type="spellStart"/>
+      <w:r>
+        <w:t>sl</w:t>
+      </w:r>
+      <w:proofErr w:type="spellEnd"/>
+      <w:r>
+        <w:t xml:space="preserve"> is an</w:t>
+      </w:r>
+      <w:r>
+        <w:rPr>
+          <w:b/>
+          <w:bCs/>
+        </w:rPr>
+        <w:t xml:space="preserve"> object</w:t>
+      </w:r>
+      <w:r>
+        <w:t xml:space="preserve"> or </w:t>
+      </w:r>
+      <w:r>
+        <w:rPr>
+          <w:b/>
+          <w:bCs/>
+        </w:rPr>
+        <w:t>instance</w:t>
+      </w:r>
+    </w:p>
+    <w:p>
+      <w:pPr>
+        <w:rPr>
+          <w:lang w:val="en-US" w:bidi="ar-DZ"/>
+        </w:rPr>
+      </w:pPr>
+      <w:r>
+        <w:rPr>
+          <w:noProof/>
+        </w:rPr>
+        <w:drawing>
+          <wp:inline distT="0" distB="0" distL="0" distR="0" wp14:anchorId="49AAB218" wp14:editId="491DEBBF">
+            <wp:extent cx="6553200" cy="714375"/>
+            <wp:effectExtent l="0" t="0" r="0" b="9525"/>
+            <wp:docPr id="532229179" name="Picture 1"/>
+            <wp:cNvGraphicFramePr>
+              <a:graphicFrameLocks xmlns:a="http://schemas.openxmlformats.org/drawingml/2006/main" noChangeAspect="1"/>
+            </wp:cNvGraphicFramePr>
+            <a:graphic xmlns:a="http://schemas.openxmlformats.org/drawingml/2006/main">
+              <a:graphicData uri="http://schemas.openxmlformats.org/drawingml/2006/picture">
+                <pic:pic xmlns:pic="http://schemas.openxmlformats.org/drawingml/2006/picture">
+                  <pic:nvPicPr>
+                    <pic:cNvPr id="532229179" name=""/>
+                    <pic:cNvPicPr/>
+                  </pic:nvPicPr>
+                  <pic:blipFill>
+                    <a:blip r:embed="rId8"/>
+                    <a:stretch>
+                      <a:fillRect/>
+                    </a:stretch>
+                  </pic:blipFill>
+                  <pic:spPr>
+                    <a:xfrm>
+                      <a:off x="0" y="0"/>
+                      <a:ext cx="6553200" cy="714375"/>
+                    </a:xfrm>
+                    <a:prstGeom prst="rect">
+                      <a:avLst/>
+                    </a:prstGeom>
+                  </pic:spPr>
+                </pic:pic>
+              </a:graphicData>
+            </a:graphic>
+          </wp:inline>
+        </w:drawing>
+      </w:r>
+    </w:p>
+    <w:p>
+      <w:pPr>
+        <w:rPr>
+          <w:lang w:val="en-US" w:bidi="ar-DZ"/>
+        </w:rPr>
+      </w:pPr>
+    </w:p>
+    <w:p>
+      <w:pPr>
+        <w:rPr>
+          <w:b/>
+          <w:bCs/>
+        </w:rPr>
+      </w:pPr>
+      <w:r>
+        <w:rPr>
+          <w:b/>
+          <w:bCs/>
+        </w:rPr>
+        <w:lastRenderedPageBreak/>
+        <w:t xml:space="preserve">Example: </w:t>
+      </w:r>
+    </w:p>
+    <w:p>
+      <w:r>
+        <w:t>A large hospital currently manages patient information, doctor schedules, appointments, medical records, billing, prescriptions, laboratory tests, and admissions using multiple disconnected systems and manual paperwork. This causes appointment conflicts, duplicate patient records, delays in accessing medical histories, billing errors, and poor communication between departments. The hospital requires an integrated Healthcare Management System that securely stores patient information, allows online appointment scheduling, manages doctor availability, records diagnoses and treatments, generates prescriptions, processes laboratory requests and results, manages hospital admissions, and handles billing and payments. The system should ensure that authorized healthcare staff can efficiently access accurate information while maintaining patient privacy and improving the quality of healthcare services.</w:t>
+      </w:r>
+    </w:p>
+    <w:p>
+      <w:pPr>
+        <w:rPr>
+          <w:b/>
+          <w:bCs/>
+          <w:u w:val="single"/>
+        </w:rPr>
+      </w:pPr>
+      <w:r>
+        <w:rPr>
+          <w:b/>
+          <w:bCs/>
+          <w:u w:val="single"/>
+        </w:rPr>
+        <w:t>Step 1: Identify the Classes</w:t>
+      </w:r>
+    </w:p>
+    <w:p>
+      <w:r>
+        <w:t>From the problem statement, the two main nouns are:</w:t>
+      </w:r>
+    </w:p>
+    <w:p>
+      <w:pPr>
+        <w:numPr>
+          <w:ilvl w:val="0"/>
+          <w:numId w:val="4"/>
+        </w:numPr>
+        <w:rPr>
+          <w:b/>
+          <w:bCs/>
+        </w:rPr>
+      </w:pPr>
+      <w:r>
+        <w:rPr>
+          <w:b/>
+          <w:bCs/>
+        </w:rPr>
+        <w:t xml:space="preserve">Patient </w:t>
+      </w:r>
+    </w:p>
+    <w:p>
+      <w:pPr>
+        <w:numPr>
+          <w:ilvl w:val="0"/>
+          <w:numId w:val="4"/>
+        </w:numPr>
+        <w:rPr>
+          <w:b/>
+          <w:bCs/>
+        </w:rPr>
+      </w:pPr>
+      <w:r>
+        <w:rPr>
+          <w:b/>
+          <w:bCs/>
+        </w:rPr>
+        <w:t xml:space="preserve">Doctor </w:t>
+      </w:r>
+    </w:p>
+    <w:p>
+      <w:r>
+        <w:t>These become the two primary classes in our healthcare system.</w:t>
+      </w:r>
+    </w:p>
+    <w:p/>
+    <w:p>
+      <w:pPr>
+        <w:rPr>
+          <w:b/>
+          <w:bCs/>
+          <w:u w:val="single"/>
+        </w:rPr>
+      </w:pPr>
+      <w:r>
+        <w:rPr>
+          <w:b/>
+          <w:bCs/>
+          <w:u w:val="single"/>
+        </w:rPr>
+        <w:t>Step 2: Identify the Responsibilities</w:t>
+      </w:r>
+    </w:p>
+    <w:p>
+      <w:pPr>
+        <w:rPr>
+          <w:b/>
+          <w:bCs/>
+        </w:rPr>
+      </w:pPr>
+      <w:r>
+        <w:rPr>
+          <w:b/>
+          <w:bCs/>
+        </w:rPr>
+        <w:t>Patient Class</w:t>
+      </w:r>
+    </w:p>
+    <w:p>
+      <w:r>
+        <w:t xml:space="preserve">The </w:t>
+      </w:r>
+      <w:r>
+        <w:rPr>
+          <w:b/>
+          <w:bCs/>
+        </w:rPr>
+        <w:t>Patient</w:t>
+      </w:r>
+      <w:r>
+        <w:t xml:space="preserve"> class represents a person receiving medical care.</w:t>
+      </w:r>
+    </w:p>
+    <w:p>
+      <w:pPr>
+        <w:rPr>
+          <w:b/>
+          <w:bCs/>
+        </w:rPr>
+      </w:pPr>
+      <w:r>
+        <w:rPr>
+          <w:b/>
+          <w:bCs/>
+        </w:rPr>
+        <w:t>Attributes (Data)</w:t>
+      </w:r>
+    </w:p>
+    <w:p>
+      <w:pPr>
+        <w:numPr>
+          <w:ilvl w:val="0"/>
+          <w:numId w:val="5"/>
+        </w:numPr>
+      </w:pPr>
+      <w:r>
+        <w:t xml:space="preserve">Patient ID </w:t>
+      </w:r>
+    </w:p>
+    <w:p>
+      <w:pPr>
+        <w:numPr>
+          <w:ilvl w:val="0"/>
+          <w:numId w:val="5"/>
+        </w:numPr>
+      </w:pPr>
+      <w:r>
+        <w:t xml:space="preserve">Name </w:t>
+      </w:r>
+    </w:p>
+    <w:p>
+      <w:pPr>
+        <w:numPr>
+          <w:ilvl w:val="0"/>
+          <w:numId w:val="5"/>
+        </w:numPr>
+      </w:pPr>
+      <w:r>
+        <w:t xml:space="preserve">Age </w:t>
+      </w:r>
+    </w:p>
+    <w:p>
+      <w:pPr>
+        <w:numPr>
+          <w:ilvl w:val="0"/>
+          <w:numId w:val="5"/>
+        </w:numPr>
+      </w:pPr>
+      <w:r>
+        <w:t xml:space="preserve">Gender </w:t>
+      </w:r>
+    </w:p>
+    <w:p>
+      <w:pPr>
+        <w:numPr>
+          <w:ilvl w:val="0"/>
+          <w:numId w:val="5"/>
+        </w:numPr>
+      </w:pPr>
+      <w:r>
+        <w:t xml:space="preserve">Phone Number </w:t>
+      </w:r>
+    </w:p>
+    <w:p>
+      <w:pPr>
+        <w:numPr>
+          <w:ilvl w:val="0"/>
+          <w:numId w:val="5"/>
+        </w:numPr>
+      </w:pPr>
+      <w:r>
+        <w:t xml:space="preserve">Disease/Symptoms </w:t>
+      </w:r>
+    </w:p>
+    <w:p>
+      <w:pPr>
+        <w:rPr>
+          <w:b/>
+          <w:bCs/>
+        </w:rPr>
+      </w:pPr>
+      <w:r>
+        <w:rPr>
+          <w:b/>
+          <w:bCs/>
+        </w:rPr>
+        <w:t>Methods (</w:t>
+      </w:r>
+      <w:proofErr w:type="spellStart"/>
+      <w:r>
+        <w:rPr>
+          <w:b/>
+          <w:bCs/>
+        </w:rPr>
+        <w:t>Behavior</w:t>
+      </w:r>
+      <w:proofErr w:type="spellEnd"/>
+      <w:r>
+        <w:rPr>
+          <w:b/>
+          <w:bCs/>
+        </w:rPr>
+        <w:t>)</w:t>
+      </w:r>
+    </w:p>
+    <w:p>
+      <w:pPr>
+        <w:numPr>
+          <w:ilvl w:val="0"/>
+          <w:numId w:val="6"/>
+        </w:numPr>
+      </w:pPr>
+      <w:proofErr w:type="gramStart"/>
+      <w:r>
+        <w:t>register(</w:t>
+      </w:r>
+      <w:proofErr w:type="gramEnd"/>
+      <w:r>
+        <w:t xml:space="preserve">) </w:t>
+      </w:r>
+    </w:p>
+    <w:p>
+      <w:pPr>
+        <w:numPr>
+          <w:ilvl w:val="0"/>
+          <w:numId w:val="6"/>
+        </w:numPr>
+      </w:pPr>
+      <w:proofErr w:type="spellStart"/>
+      <w:proofErr w:type="gramStart"/>
+      <w:r>
+        <w:t>bookAppointment</w:t>
+      </w:r>
+      <w:proofErr w:type="spellEnd"/>
+      <w:r>
+        <w:t>(</w:t>
+      </w:r>
+      <w:proofErr w:type="gramEnd"/>
+      <w:r>
+        <w:t xml:space="preserve">) </w:t>
+      </w:r>
+    </w:p>
+    <w:p>
+      <w:pPr>
+        <w:numPr>
+          <w:ilvl w:val="0"/>
+          <w:numId w:val="6"/>
+        </w:numPr>
+      </w:pPr>
+      <w:proofErr w:type="spellStart"/>
+      <w:proofErr w:type="gramStart"/>
+      <w:r>
+        <w:t>cancelAppointment</w:t>
+      </w:r>
+      <w:proofErr w:type="spellEnd"/>
+      <w:r>
+        <w:t>(</w:t>
+      </w:r>
+      <w:proofErr w:type="gramEnd"/>
+      <w:r>
+        <w:t xml:space="preserve">) </w:t>
+      </w:r>
+    </w:p>
+    <w:p>
+      <w:pPr>
+        <w:numPr>
+          <w:ilvl w:val="0"/>
+          <w:numId w:val="6"/>
+        </w:numPr>
+      </w:pPr>
+      <w:proofErr w:type="spellStart"/>
+      <w:proofErr w:type="gramStart"/>
+      <w:r>
+        <w:t>viewDoctor</w:t>
+      </w:r>
+      <w:proofErr w:type="spellEnd"/>
+      <w:r>
+        <w:t>(</w:t>
+      </w:r>
+      <w:proofErr w:type="gramEnd"/>
+      <w:r>
+        <w:t xml:space="preserve">) </w:t>
+      </w:r>
+    </w:p>
+    <w:p>
+      <w:pPr>
+        <w:numPr>
+          <w:ilvl w:val="0"/>
+          <w:numId w:val="6"/>
+        </w:numPr>
+      </w:pPr>
+      <w:proofErr w:type="spellStart"/>
+      <w:proofErr w:type="gramStart"/>
+      <w:r>
+        <w:t>viewPrescription</w:t>
+      </w:r>
+      <w:proofErr w:type="spellEnd"/>
+      <w:r>
+        <w:t>(</w:t>
+      </w:r>
+      <w:proofErr w:type="gramEnd"/>
+      <w:r>
+        <w:t>)</w:t>
+      </w:r>
+    </w:p>
+    <w:p>
+      <w:pPr>
+        <w:ind w:left="720"/>
+      </w:pPr>
+    </w:p>
+    <w:p>
+      <w:pPr>
+        <w:ind w:left="720"/>
+      </w:pPr>
+    </w:p>
+    <w:p>
+      <w:pPr>
+        <w:ind w:left="720"/>
+      </w:pPr>
+    </w:p>
+    <w:p>
+      <w:pPr>
+        <w:ind w:left="720"/>
+      </w:pPr>
+    </w:p>
+    <w:p>
+      <w:pPr>
+        <w:ind w:left="720"/>
+      </w:pPr>
+    </w:p>
+    <w:p>
+      <w:pPr>
+        <w:ind w:left="720"/>
+        <w:jc w:val="center"/>
+      </w:pPr>
+      <w:r>
+        <w:rPr>
+          <w:noProof/>
+        </w:rPr>
+        <w:lastRenderedPageBreak/>
+        <w:drawing>
+          <wp:inline distT="0" distB="0" distL="0" distR="0" wp14:anchorId="4ABC2709" wp14:editId="6C58CEED">
+            <wp:extent cx="5477510" cy="4191000"/>
+            <wp:effectExtent l="0" t="0" r="8890" b="0"/>
+            <wp:docPr id="1862350604" name="Picture 1"/>
+            <wp:cNvGraphicFramePr>
+              <a:graphicFrameLocks xmlns:a="http://schemas.openxmlformats.org/drawingml/2006/main" noChangeAspect="1"/>
+            </wp:cNvGraphicFramePr>
+            <a:graphic xmlns:a="http://schemas.openxmlformats.org/drawingml/2006/main">
+              <a:graphicData uri="http://schemas.openxmlformats.org/drawingml/2006/picture">
+                <pic:pic xmlns:pic="http://schemas.openxmlformats.org/drawingml/2006/picture">
+                  <pic:nvPicPr>
+                    <pic:cNvPr id="1862350604" name="Picture 1862350604"/>
+                    <pic:cNvPicPr/>
+                  </pic:nvPicPr>
+                  <pic:blipFill>
+                    <a:blip r:embed="rId9">
+                      <a:extLst>
+                        <a:ext uri="{28A0092B-C50C-407E-A947-70E740481C1C}">
+                          <a14:useLocalDpi xmlns:a14="http://schemas.microsoft.com/office/drawing/2010/main" val="0"/>
+                        </a:ext>
+                      </a:extLst>
+                    </a:blip>
+                    <a:stretch>
+                      <a:fillRect/>
+                    </a:stretch>
+                  </pic:blipFill>
+                  <pic:spPr>
+                    <a:xfrm>
+                      <a:off x="0" y="0"/>
+                      <a:ext cx="5523572" cy="4226243"/>
+                    </a:xfrm>
+                    <a:prstGeom prst="rect">
+                      <a:avLst/>
+                    </a:prstGeom>
+                  </pic:spPr>
+                </pic:pic>
+              </a:graphicData>
+            </a:graphic>
+          </wp:inline>
+        </w:drawing>
+      </w:r>
+    </w:p>
+    <w:p/>
+    <w:p>
+      <w:pPr>
+        <w:jc w:val="center"/>
+      </w:pPr>
+      <w:r>
+        <w:rPr>
+          <w:noProof/>
+        </w:rPr>
+        <w:drawing>
+          <wp:inline distT="0" distB="0" distL="0" distR="0" wp14:anchorId="3C4FAFD4" wp14:editId="28F4D2EF">
+            <wp:extent cx="6661150" cy="2861945"/>
+            <wp:effectExtent l="0" t="0" r="6350" b="0"/>
+            <wp:docPr id="333054399" name="Picture 1"/>
+            <wp:cNvGraphicFramePr>
+              <a:graphicFrameLocks xmlns:a="http://schemas.openxmlformats.org/drawingml/2006/main" noChangeAspect="1"/>
+            </wp:cNvGraphicFramePr>
+            <a:graphic xmlns:a="http://schemas.openxmlformats.org/drawingml/2006/main">
+              <a:graphicData uri="http://schemas.openxmlformats.org/drawingml/2006/picture">
+                <pic:pic xmlns:pic="http://schemas.openxmlformats.org/drawingml/2006/picture">
+                  <pic:nvPicPr>
+                    <pic:cNvPr id="333054399" name=""/>
+                    <pic:cNvPicPr/>
+                  </pic:nvPicPr>
+                  <pic:blipFill>
+                    <a:blip r:embed="rId10"/>
+                    <a:stretch>
+                      <a:fillRect/>
+                    </a:stretch>
+                  </pic:blipFill>
+                  <pic:spPr>
+                    <a:xfrm>
+                      <a:off x="0" y="0"/>
+                      <a:ext cx="6661150" cy="2861945"/>
+                    </a:xfrm>
+                    <a:prstGeom prst="rect">
+                      <a:avLst/>
+                    </a:prstGeom>
+                  </pic:spPr>
+                </pic:pic>
+              </a:graphicData>
+            </a:graphic>
+          </wp:inline>
+        </w:drawing>
+      </w:r>
+    </w:p>
+    <w:p>
+      <w:pPr>
+        <w:rPr>
+          <w:b/>
+          <w:bCs/>
+        </w:rPr>
+      </w:pPr>
+    </w:p>
+    <w:p>
+      <w:pPr>
+        <w:rPr>
+          <w:b/>
+          <w:bCs/>
+        </w:rPr>
+      </w:pPr>
+      <w:r>
+        <w:rPr>
+          <w:b/>
+          <w:bCs/>
+        </w:rPr>
+        <w:t>Doctor Class</w:t>
+      </w:r>
+    </w:p>
+    <w:p>
+      <w:r>
+        <w:t xml:space="preserve">The </w:t>
+      </w:r>
+      <w:r>
+        <w:rPr>
+          <w:b/>
+          <w:bCs/>
+        </w:rPr>
+        <w:t>Doctor</w:t>
+      </w:r>
+      <w:r>
+        <w:t xml:space="preserve"> class represents a healthcare professional who treats patients.</w:t>
+      </w:r>
+    </w:p>
+    <w:p>
+      <w:pPr>
+        <w:rPr>
+          <w:b/>
+          <w:bCs/>
+        </w:rPr>
+      </w:pPr>
+      <w:r>
+        <w:rPr>
+          <w:b/>
+          <w:bCs/>
+        </w:rPr>
+        <w:t>Attributes (Data)</w:t>
+      </w:r>
+    </w:p>
+    <w:p>
+      <w:pPr>
+        <w:numPr>
+          <w:ilvl w:val="0"/>
+          <w:numId w:val="7"/>
+        </w:numPr>
+      </w:pPr>
+      <w:r>
+        <w:t xml:space="preserve">Doctor ID </w:t>
+      </w:r>
+    </w:p>
+    <w:p>
+      <w:pPr>
+        <w:numPr>
+          <w:ilvl w:val="0"/>
+          <w:numId w:val="7"/>
+        </w:numPr>
+      </w:pPr>
+      <w:r>
+        <w:t xml:space="preserve">Name </w:t>
+      </w:r>
+    </w:p>
+    <w:p>
+      <w:pPr>
+        <w:numPr>
+          <w:ilvl w:val="0"/>
+          <w:numId w:val="7"/>
+        </w:numPr>
+      </w:pPr>
+      <w:r>
+        <w:t xml:space="preserve">Specialization </w:t>
+      </w:r>
+    </w:p>
+    <w:p>
+      <w:pPr>
+        <w:numPr>
+          <w:ilvl w:val="0"/>
+          <w:numId w:val="7"/>
+        </w:numPr>
+      </w:pPr>
+      <w:r>
+        <w:t xml:space="preserve">Experience </w:t>
+      </w:r>
+    </w:p>
+    <w:p>
+      <w:pPr>
+        <w:numPr>
+          <w:ilvl w:val="0"/>
+          <w:numId w:val="7"/>
+        </w:numPr>
+      </w:pPr>
+      <w:r>
+        <w:lastRenderedPageBreak/>
+        <w:t xml:space="preserve">Availability </w:t>
+      </w:r>
+    </w:p>
+    <w:p>
+      <w:pPr>
+        <w:rPr>
+          <w:b/>
+          <w:bCs/>
+        </w:rPr>
+      </w:pPr>
+      <w:r>
+        <w:rPr>
+          <w:b/>
+          <w:bCs/>
+        </w:rPr>
+        <w:t>Methods (</w:t>
+      </w:r>
+      <w:proofErr w:type="spellStart"/>
+      <w:r>
+        <w:rPr>
+          <w:b/>
+          <w:bCs/>
+        </w:rPr>
+        <w:t>Behavior</w:t>
+      </w:r>
+      <w:proofErr w:type="spellEnd"/>
+      <w:r>
+        <w:rPr>
+          <w:b/>
+          <w:bCs/>
+        </w:rPr>
+        <w:t>)</w:t>
+      </w:r>
+    </w:p>
+    <w:p>
+      <w:pPr>
+        <w:numPr>
+          <w:ilvl w:val="0"/>
+          <w:numId w:val="8"/>
+        </w:numPr>
+      </w:pPr>
+      <w:proofErr w:type="spellStart"/>
+      <w:proofErr w:type="gramStart"/>
+      <w:r>
+        <w:t>viewPatient</w:t>
+      </w:r>
+      <w:proofErr w:type="spellEnd"/>
+      <w:r>
+        <w:t>(</w:t>
+      </w:r>
+      <w:proofErr w:type="gramEnd"/>
+      <w:r>
+        <w:t xml:space="preserve">) </w:t>
+      </w:r>
+    </w:p>
+    <w:p>
+      <w:pPr>
+        <w:numPr>
+          <w:ilvl w:val="0"/>
+          <w:numId w:val="8"/>
+        </w:numPr>
+      </w:pPr>
+      <w:proofErr w:type="spellStart"/>
+      <w:proofErr w:type="gramStart"/>
+      <w:r>
+        <w:t>diagnosePatient</w:t>
+      </w:r>
+      <w:proofErr w:type="spellEnd"/>
+      <w:r>
+        <w:t>(</w:t>
+      </w:r>
+      <w:proofErr w:type="gramEnd"/>
+      <w:r>
+        <w:t xml:space="preserve">) </w:t>
+      </w:r>
+    </w:p>
+    <w:p>
+      <w:pPr>
+        <w:numPr>
+          <w:ilvl w:val="0"/>
+          <w:numId w:val="8"/>
+        </w:numPr>
+      </w:pPr>
+      <w:proofErr w:type="spellStart"/>
+      <w:proofErr w:type="gramStart"/>
+      <w:r>
+        <w:t>prescribeMedicine</w:t>
+      </w:r>
+      <w:proofErr w:type="spellEnd"/>
+      <w:r>
+        <w:t>(</w:t>
+      </w:r>
+      <w:proofErr w:type="gramEnd"/>
+      <w:r>
+        <w:t xml:space="preserve">) </w:t>
+      </w:r>
+    </w:p>
+    <w:p>
+      <w:pPr>
+        <w:numPr>
+          <w:ilvl w:val="0"/>
+          <w:numId w:val="8"/>
+        </w:numPr>
+      </w:pPr>
+      <w:proofErr w:type="spellStart"/>
+      <w:proofErr w:type="gramStart"/>
+      <w:r>
+        <w:t>updateAvailability</w:t>
+      </w:r>
+      <w:proofErr w:type="spellEnd"/>
+      <w:r>
+        <w:t>(</w:t>
+      </w:r>
+      <w:proofErr w:type="gramEnd"/>
+      <w:r>
+        <w:t>)</w:t>
+      </w:r>
+    </w:p>
+    <w:p>
+      <w:pPr>
+        <w:ind w:left="360"/>
+        <w:jc w:val="center"/>
+      </w:pPr>
+      <w:r>
+        <w:rPr>
+          <w:noProof/>
+        </w:rPr>
+        <w:drawing>
+          <wp:inline distT="0" distB="0" distL="0" distR="0" wp14:anchorId="6BEB6221" wp14:editId="209C48F2">
+            <wp:extent cx="6115050" cy="3114675"/>
+            <wp:effectExtent l="0" t="0" r="0" b="9525"/>
+            <wp:docPr id="584977040" name="Picture 2"/>
+            <wp:cNvGraphicFramePr>
+              <a:graphicFrameLocks xmlns:a="http://schemas.openxmlformats.org/drawingml/2006/main" noChangeAspect="1"/>
+            </wp:cNvGraphicFramePr>
+            <a:graphic xmlns:a="http://schemas.openxmlformats.org/drawingml/2006/main">
+              <a:graphicData uri="http://schemas.openxmlformats.org/drawingml/2006/picture">
+                <pic:pic xmlns:pic="http://schemas.openxmlformats.org/drawingml/2006/picture">
+                  <pic:nvPicPr>
+                    <pic:cNvPr id="584977040" name="Picture 584977040"/>
+                    <pic:cNvPicPr/>
+                  </pic:nvPicPr>
+                  <pic:blipFill>
+                    <a:blip r:embed="rId11">
+                      <a:extLst>
+                        <a:ext uri="{28A0092B-C50C-407E-A947-70E740481C1C}">
+                          <a14:useLocalDpi xmlns:a14="http://schemas.microsoft.com/office/drawing/2010/main" val="0"/>
+                        </a:ext>
+                      </a:extLst>
+                    </a:blip>
+                    <a:stretch>
+                      <a:fillRect/>
+                    </a:stretch>
+                  </pic:blipFill>
+                  <pic:spPr>
+                    <a:xfrm>
+                      <a:off x="0" y="0"/>
+                      <a:ext cx="6128457" cy="3121504"/>
+                    </a:xfrm>
+                    <a:prstGeom prst="rect">
+                      <a:avLst/>
+                    </a:prstGeom>
+                  </pic:spPr>
+                </pic:pic>
+              </a:graphicData>
+            </a:graphic>
+          </wp:inline>
+        </w:drawing>
+      </w:r>
+    </w:p>
+    <w:p/>
+    <w:p>
+      <w:r>
+        <w:rPr>
+          <w:noProof/>
+        </w:rPr>
+        <w:drawing>
+          <wp:inline distT="0" distB="0" distL="0" distR="0" wp14:anchorId="4AE012D1" wp14:editId="021D7B62">
+            <wp:extent cx="6661150" cy="3148330"/>
+            <wp:effectExtent l="0" t="0" r="6350" b="0"/>
+            <wp:docPr id="66325268" name="Picture 1"/>
+            <wp:cNvGraphicFramePr>
+              <a:graphicFrameLocks xmlns:a="http://schemas.openxmlformats.org/drawingml/2006/main" noChangeAspect="1"/>
+            </wp:cNvGraphicFramePr>
+            <a:graphic xmlns:a="http://schemas.openxmlformats.org/drawingml/2006/main">
+              <a:graphicData uri="http://schemas.openxmlformats.org/drawingml/2006/picture">
+                <pic:pic xmlns:pic="http://schemas.openxmlformats.org/drawingml/2006/picture">
+                  <pic:nvPicPr>
+                    <pic:cNvPr id="66325268" name=""/>
+                    <pic:cNvPicPr/>
+                  </pic:nvPicPr>
+                  <pic:blipFill>
+                    <a:blip r:embed="rId12"/>
+                    <a:stretch>
+                      <a:fillRect/>
+                    </a:stretch>
+                  </pic:blipFill>
+                  <pic:spPr>
+                    <a:xfrm>
+                      <a:off x="0" y="0"/>
+                      <a:ext cx="6661150" cy="3148330"/>
+                    </a:xfrm>
+                    <a:prstGeom prst="rect">
+                      <a:avLst/>
+                    </a:prstGeom>
+                  </pic:spPr>
+                </pic:pic>
+              </a:graphicData>
+            </a:graphic>
+          </wp:inline>
+        </w:drawing>
+      </w:r>
+    </w:p>
+    <w:p/>
+    <w:p/>
+    <w:p/>
+    <w:p/>
+    <w:p/>
+    <w:p/>
+    <w:p>
+      <w:pPr>
+        <w:rPr>
+          <w:b/>
+          <w:bCs/>
+        </w:rPr>
+      </w:pPr>
+      <w:r>
+        <w:rPr>
+          <w:b/>
+          <w:bCs/>
+        </w:rPr>
+        <w:t>Step 3: Relationship Between Classes</w:t>
+      </w:r>
+    </w:p>
+    <w:p>
+      <w:r>
+        <w:t>Association ("Uses-a")</w:t>
+      </w:r>
+    </w:p>
+    <w:p>
+      <w:r>
+        <w:t xml:space="preserve">A Patient consults a </w:t>
+      </w:r>
+      <w:r>
+        <w:t>doctor</w:t>
+      </w:r>
+      <w:r>
+        <w:t xml:space="preserve">, and a </w:t>
+      </w:r>
+      <w:r>
+        <w:t>doctor</w:t>
+      </w:r>
+      <w:r>
+        <w:t xml:space="preserve"> treats many Patients.</w:t>
+      </w:r>
+    </w:p>
+    <w:p>
+      <w:pPr>
+        <w:jc w:val="center"/>
+      </w:pPr>
+      <w:r>
+        <w:rPr>
+          <w:noProof/>
+        </w:rPr>
+        <w:drawing>
+          <wp:inline distT="0" distB="0" distL="0" distR="0" wp14:anchorId="4958A6A8" wp14:editId="52D9B29A">
+            <wp:extent cx="6355080" cy="3171825"/>
+            <wp:effectExtent l="0" t="0" r="7620" b="9525"/>
+            <wp:docPr id="1298885292" name="Picture 3"/>
+            <wp:cNvGraphicFramePr>
+              <a:graphicFrameLocks xmlns:a="http://schemas.openxmlformats.org/drawingml/2006/main" noChangeAspect="1"/>
+            </wp:cNvGraphicFramePr>
+            <a:graphic xmlns:a="http://schemas.openxmlformats.org/drawingml/2006/main">
+              <a:graphicData uri="http://schemas.openxmlformats.org/drawingml/2006/picture">
+                <pic:pic xmlns:pic="http://schemas.openxmlformats.org/drawingml/2006/picture">
+                  <pic:nvPicPr>
+                    <pic:cNvPr id="1298885292" name="Picture 1298885292"/>
+                    <pic:cNvPicPr/>
+                  </pic:nvPicPr>
+                  <pic:blipFill>
+                    <a:blip r:embed="rId13">
+                      <a:extLst>
+                        <a:ext uri="{28A0092B-C50C-407E-A947-70E740481C1C}">
+                          <a14:useLocalDpi xmlns:a14="http://schemas.microsoft.com/office/drawing/2010/main" val="0"/>
+                        </a:ext>
+                      </a:extLst>
+                    </a:blip>
+                    <a:stretch>
+                      <a:fillRect/>
+                    </a:stretch>
+                  </pic:blipFill>
+                  <pic:spPr>
+                    <a:xfrm>
+                      <a:off x="0" y="0"/>
+                      <a:ext cx="6372061" cy="3180300"/>
+                    </a:xfrm>
+                    <a:prstGeom prst="rect">
+                      <a:avLst/>
+                    </a:prstGeom>
+                  </pic:spPr>
+                </pic:pic>
+              </a:graphicData>
+            </a:graphic>
+          </wp:inline>
+        </w:drawing>
+      </w:r>
+    </w:p>
+    <w:p>
+      <w:pPr>
+        <w:rPr>
+          <w:b/>
+          <w:bCs/>
+        </w:rPr>
+      </w:pPr>
+      <w:r>
+        <w:rPr>
+          <w:b/>
+          <w:bCs/>
+        </w:rPr>
+        <w:t>How the Relationship is Represented in the Code</w:t>
+      </w:r>
+    </w:p>
+    <w:p>
+      <w:r>
+        <w:t xml:space="preserve">The </w:t>
+      </w:r>
+      <w:r>
+        <w:rPr>
+          <w:b/>
+          <w:bCs/>
+        </w:rPr>
+        <w:t>association relationship</w:t>
+      </w:r>
+      <w:r>
+        <w:t xml:space="preserve"> between the Patient and Doctor classes is represented by passing a </w:t>
+      </w:r>
+      <w:proofErr w:type="gramStart"/>
+      <w:r>
+        <w:t>Doctor</w:t>
+      </w:r>
+      <w:proofErr w:type="gramEnd"/>
+      <w:r>
+        <w:t xml:space="preserve"> object as a parameter to the </w:t>
+      </w:r>
+      <w:proofErr w:type="spellStart"/>
+      <w:proofErr w:type="gramStart"/>
+      <w:r>
+        <w:t>consultDoctor</w:t>
+      </w:r>
+      <w:proofErr w:type="spellEnd"/>
+      <w:r>
+        <w:t>(</w:t>
+      </w:r>
+      <w:proofErr w:type="gramEnd"/>
+      <w:r>
+        <w:t xml:space="preserve">) method and a Patient object as a parameter to the </w:t>
+      </w:r>
+      <w:proofErr w:type="spellStart"/>
+      <w:proofErr w:type="gramStart"/>
+      <w:r>
+        <w:t>diagnosePatient</w:t>
+      </w:r>
+      <w:proofErr w:type="spellEnd"/>
+      <w:r>
+        <w:t>(</w:t>
+      </w:r>
+      <w:proofErr w:type="gramEnd"/>
+      <w:r>
+        <w:t>) method. This allows the two independent objects to communicate by calling each other's methods without either object owning the other. Their interaction is established through method calls and object references, which is a common way to represent an association relationship in object-oriented programming.</w:t>
+      </w:r>
+    </w:p>
+    <w:p>
+      <w:r>
+        <w:rPr>
+          <w:noProof/>
+        </w:rPr>
+        <w:drawing>
+          <wp:inline distT="0" distB="0" distL="0" distR="0" wp14:anchorId="58BC107E" wp14:editId="44442350">
+            <wp:extent cx="6661150" cy="1102995"/>
+            <wp:effectExtent l="0" t="0" r="6350" b="1905"/>
+            <wp:docPr id="1431307498" name="Picture 1"/>
+            <wp:cNvGraphicFramePr>
+              <a:graphicFrameLocks xmlns:a="http://schemas.openxmlformats.org/drawingml/2006/main" noChangeAspect="1"/>
+            </wp:cNvGraphicFramePr>
+            <a:graphic xmlns:a="http://schemas.openxmlformats.org/drawingml/2006/main">
+              <a:graphicData uri="http://schemas.openxmlformats.org/drawingml/2006/picture">
+                <pic:pic xmlns:pic="http://schemas.openxmlformats.org/drawingml/2006/picture">
+                  <pic:nvPicPr>
+                    <pic:cNvPr id="1431307498" name=""/>
+                    <pic:cNvPicPr/>
+                  </pic:nvPicPr>
+                  <pic:blipFill>
+                    <a:blip r:embed="rId14"/>
+                    <a:stretch>
+                      <a:fillRect/>
+                    </a:stretch>
+                  </pic:blipFill>
+                  <pic:spPr>
+                    <a:xfrm>
+                      <a:off x="0" y="0"/>
+                      <a:ext cx="6661150" cy="1102995"/>
+                    </a:xfrm>
+                    <a:prstGeom prst="rect">
+                      <a:avLst/>
+                    </a:prstGeom>
+                  </pic:spPr>
+                </pic:pic>
+              </a:graphicData>
+            </a:graphic>
+          </wp:inline>
+        </w:drawing>
+      </w:r>
+    </w:p>
+    <w:p/>
+    <w:p>
+      <w:r>
+        <w:rPr>
+          <w:noProof/>
+        </w:rPr>
+        <w:drawing>
+          <wp:inline distT="0" distB="0" distL="0" distR="0" wp14:anchorId="6E68CEF3" wp14:editId="0AA64616">
+            <wp:extent cx="6661150" cy="1398270"/>
+            <wp:effectExtent l="0" t="0" r="6350" b="0"/>
+            <wp:docPr id="1652935933" name="Picture 1"/>
+            <wp:cNvGraphicFramePr>
+              <a:graphicFrameLocks xmlns:a="http://schemas.openxmlformats.org/drawingml/2006/main" noChangeAspect="1"/>
+            </wp:cNvGraphicFramePr>
+            <a:graphic xmlns:a="http://schemas.openxmlformats.org/drawingml/2006/main">
+              <a:graphicData uri="http://schemas.openxmlformats.org/drawingml/2006/picture">
+                <pic:pic xmlns:pic="http://schemas.openxmlformats.org/drawingml/2006/picture">
+                  <pic:nvPicPr>
+                    <pic:cNvPr id="1652935933" name=""/>
+                    <pic:cNvPicPr/>
+                  </pic:nvPicPr>
+                  <pic:blipFill>
+                    <a:blip r:embed="rId15"/>
+                    <a:stretch>
+                      <a:fillRect/>
+                    </a:stretch>
+                  </pic:blipFill>
+                  <pic:spPr>
+                    <a:xfrm>
+                      <a:off x="0" y="0"/>
+                      <a:ext cx="6661150" cy="1398270"/>
+                    </a:xfrm>
+                    <a:prstGeom prst="rect">
+                      <a:avLst/>
+                    </a:prstGeom>
+                  </pic:spPr>
+                </pic:pic>
+              </a:graphicData>
+            </a:graphic>
+          </wp:inline>
+        </w:drawing>
+      </w:r>
+    </w:p>
+    <w:p>
+      <w:pPr>
+        <w:jc w:val="center"/>
+      </w:pPr>
+    </w:p>
+    <w:p>
+      <w:pPr>
+        <w:rPr>
+          <w:b/>
+          <w:bCs/>
+        </w:rPr>
+      </w:pPr>
+      <w:r>
+        <w:rPr>
+          <w:b/>
+          <w:bCs/>
+        </w:rPr>
+        <w:t>4.2 Using Predefined Classes</w:t>
+      </w:r>
+    </w:p>
+    <w:p/>
+    <w:p/>
     <w:sectPr>
       <w:pgSz w:w="11906" w:h="16838"/>
       <w:pgMar w:top="567" w:right="707" w:bottom="709" w:left="709" w:header="708" w:footer="708" w:gutter="0"/>
@@ -88,6 +2488,1227 @@
     </w:sectPr>
   </w:body>
 </w:document>
+</file>
+
+<file path=word/numbering.xml><?xml version="1.0" encoding="utf-8"?>
+<w:numbering xmlns:wpc="http://schemas.microsoft.com/office/word/2010/wordprocessingCanvas" xmlns:cx="http://schemas.microsoft.com/office/drawing/2014/chartex" xmlns:cx1="http://schemas.microsoft.com/office/drawing/2015/9/8/chartex" xmlns:cx2="http://schemas.microsoft.com/office/drawing/2015/10/21/chartex" xmlns:cx3="http://schemas.microsoft.com/office/drawing/2016/5/9/chartex" xmlns:cx4="http://schemas.microsoft.com/office/drawing/2016/5/10/chartex" xmlns:cx5="http://schemas.microsoft.com/office/drawing/2016/5/11/chartex" xmlns:cx6="http://schemas.microsoft.com/office/drawing/2016/5/12/chartex" xmlns:cx7="http://schemas.microsoft.com/office/drawing/2016/5/13/chartex" xmlns:cx8="http://schemas.microsoft.com/office/drawing/2016/5/14/chartex" xmlns:mc="http://schemas.openxmlformats.org/markup-compatibility/2006" xmlns:aink="http://schemas.microsoft.com/office/drawing/2016/ink" xmlns:am3d="http://schemas.microsoft.com/office/drawing/2017/model3d" xmlns:o="urn:schemas-microsoft-com:office:office" xmlns:oel="http://schemas.microsoft.com/office/2019/extlst" xmlns:r="http://schemas.openxmlformats.org/officeDocument/2006/relationships" xmlns:m="http://schemas.openxmlformats.org/officeDocument/2006/math" xmlns:v="urn:schemas-microsoft-com:vml" xmlns:wp14="http://schemas.microsoft.com/office/word/2010/wordprocessingDrawing" xmlns:wp="http://schemas.openxmlformats.org/drawingml/2006/wordprocessingDrawing" xmlns:w10="urn:schemas-microsoft-com:office:word" xmlns:w="http://schemas.openxmlformats.org/wordprocessingml/2006/main" xmlns:w14="http://schemas.microsoft.com/office/word/2010/wordml" xmlns:w15="http://schemas.microsoft.com/office/word/2012/wordml" xmlns:w16cex="http://schemas.microsoft.com/office/word/2018/wordml/cex" xmlns:w16cid="http://schemas.microsoft.com/office/word/2016/wordml/cid" xmlns:w16="http://schemas.microsoft.com/office/word/2018/wordml" xmlns:w16du="http://schemas.microsoft.com/office/word/2023/wordml/word16du" xmlns:w16sdtdh="http://schemas.microsoft.com/office/word/2020/wordml/sdtdatahash" xmlns:w16sdtfl="http://schemas.microsoft.com/office/word/2024/wordml/sdtformatlock" xmlns:w16se="http://schemas.microsoft.com/office/word/2015/wordml/symex" xmlns:wpg="http://schemas.microsoft.com/office/word/2010/wordprocessingGroup" xmlns:wpi="http://schemas.microsoft.com/office/word/2010/wordprocessingInk" xmlns:wne="http://schemas.microsoft.com/office/word/2006/wordml" xmlns:wps="http://schemas.microsoft.com/office/word/2010/wordprocessingShape" mc:Ignorable="w14 w15 w16se w16cid w16 w16cex w16sdtdh w16sdtfl w16du wp14">
+  <w:abstractNum w:abstractNumId="0" w15:restartNumberingAfterBreak="0">
+    <w:nsid w:val="00D47D2A"/>
+    <w:multiLevelType w:val="multilevel"/>
+    <w:tmpl w:val="F948D5DA"/>
+    <w:lvl w:ilvl="0">
+      <w:start w:val="1"/>
+      <w:numFmt w:val="bullet"/>
+      <w:lvlText w:val=""/>
+      <w:lvlJc w:val="left"/>
+      <w:pPr>
+        <w:tabs>
+          <w:tab w:val="num" w:pos="720"/>
+        </w:tabs>
+        <w:ind w:left="720" w:hanging="360"/>
+      </w:pPr>
+      <w:rPr>
+        <w:rFonts w:ascii="Symbol" w:hAnsi="Symbol" w:hint="default"/>
+        <w:sz w:val="20"/>
+      </w:rPr>
+    </w:lvl>
+    <w:lvl w:ilvl="1" w:tentative="1">
+      <w:start w:val="1"/>
+      <w:numFmt w:val="bullet"/>
+      <w:lvlText w:val="o"/>
+      <w:lvlJc w:val="left"/>
+      <w:pPr>
+        <w:tabs>
+          <w:tab w:val="num" w:pos="1440"/>
+        </w:tabs>
+        <w:ind w:left="1440" w:hanging="360"/>
+      </w:pPr>
+      <w:rPr>
+        <w:rFonts w:ascii="Courier New" w:hAnsi="Courier New" w:hint="default"/>
+        <w:sz w:val="20"/>
+      </w:rPr>
+    </w:lvl>
+    <w:lvl w:ilvl="2" w:tentative="1">
+      <w:start w:val="1"/>
+      <w:numFmt w:val="bullet"/>
+      <w:lvlText w:val=""/>
+      <w:lvlJc w:val="left"/>
+      <w:pPr>
+        <w:tabs>
+          <w:tab w:val="num" w:pos="2160"/>
+        </w:tabs>
+        <w:ind w:left="2160" w:hanging="360"/>
+      </w:pPr>
+      <w:rPr>
+        <w:rFonts w:ascii="Wingdings" w:hAnsi="Wingdings" w:hint="default"/>
+        <w:sz w:val="20"/>
+      </w:rPr>
+    </w:lvl>
+    <w:lvl w:ilvl="3" w:tentative="1">
+      <w:start w:val="1"/>
+      <w:numFmt w:val="bullet"/>
+      <w:lvlText w:val=""/>
+      <w:lvlJc w:val="left"/>
+      <w:pPr>
+        <w:tabs>
+          <w:tab w:val="num" w:pos="2880"/>
+        </w:tabs>
+        <w:ind w:left="2880" w:hanging="360"/>
+      </w:pPr>
+      <w:rPr>
+        <w:rFonts w:ascii="Wingdings" w:hAnsi="Wingdings" w:hint="default"/>
+        <w:sz w:val="20"/>
+      </w:rPr>
+    </w:lvl>
+    <w:lvl w:ilvl="4" w:tentative="1">
+      <w:start w:val="1"/>
+      <w:numFmt w:val="bullet"/>
+      <w:lvlText w:val=""/>
+      <w:lvlJc w:val="left"/>
+      <w:pPr>
+        <w:tabs>
+          <w:tab w:val="num" w:pos="3600"/>
+        </w:tabs>
+        <w:ind w:left="3600" w:hanging="360"/>
+      </w:pPr>
+      <w:rPr>
+        <w:rFonts w:ascii="Wingdings" w:hAnsi="Wingdings" w:hint="default"/>
+        <w:sz w:val="20"/>
+      </w:rPr>
+    </w:lvl>
+    <w:lvl w:ilvl="5" w:tentative="1">
+      <w:start w:val="1"/>
+      <w:numFmt w:val="bullet"/>
+      <w:lvlText w:val=""/>
+      <w:lvlJc w:val="left"/>
+      <w:pPr>
+        <w:tabs>
+          <w:tab w:val="num" w:pos="4320"/>
+        </w:tabs>
+        <w:ind w:left="4320" w:hanging="360"/>
+      </w:pPr>
+      <w:rPr>
+        <w:rFonts w:ascii="Wingdings" w:hAnsi="Wingdings" w:hint="default"/>
+        <w:sz w:val="20"/>
+      </w:rPr>
+    </w:lvl>
+    <w:lvl w:ilvl="6" w:tentative="1">
+      <w:start w:val="1"/>
+      <w:numFmt w:val="bullet"/>
+      <w:lvlText w:val=""/>
+      <w:lvlJc w:val="left"/>
+      <w:pPr>
+        <w:tabs>
+          <w:tab w:val="num" w:pos="5040"/>
+        </w:tabs>
+        <w:ind w:left="5040" w:hanging="360"/>
+      </w:pPr>
+      <w:rPr>
+        <w:rFonts w:ascii="Wingdings" w:hAnsi="Wingdings" w:hint="default"/>
+        <w:sz w:val="20"/>
+      </w:rPr>
+    </w:lvl>
+    <w:lvl w:ilvl="7" w:tentative="1">
+      <w:start w:val="1"/>
+      <w:numFmt w:val="bullet"/>
+      <w:lvlText w:val=""/>
+      <w:lvlJc w:val="left"/>
+      <w:pPr>
+        <w:tabs>
+          <w:tab w:val="num" w:pos="5760"/>
+        </w:tabs>
+        <w:ind w:left="5760" w:hanging="360"/>
+      </w:pPr>
+      <w:rPr>
+        <w:rFonts w:ascii="Wingdings" w:hAnsi="Wingdings" w:hint="default"/>
+        <w:sz w:val="20"/>
+      </w:rPr>
+    </w:lvl>
+    <w:lvl w:ilvl="8" w:tentative="1">
+      <w:start w:val="1"/>
+      <w:numFmt w:val="bullet"/>
+      <w:lvlText w:val=""/>
+      <w:lvlJc w:val="left"/>
+      <w:pPr>
+        <w:tabs>
+          <w:tab w:val="num" w:pos="6480"/>
+        </w:tabs>
+        <w:ind w:left="6480" w:hanging="360"/>
+      </w:pPr>
+      <w:rPr>
+        <w:rFonts w:ascii="Wingdings" w:hAnsi="Wingdings" w:hint="default"/>
+        <w:sz w:val="20"/>
+      </w:rPr>
+    </w:lvl>
+  </w:abstractNum>
+  <w:abstractNum w:abstractNumId="1" w15:restartNumberingAfterBreak="0">
+    <w:nsid w:val="113959A4"/>
+    <w:multiLevelType w:val="multilevel"/>
+    <w:tmpl w:val="850CC308"/>
+    <w:lvl w:ilvl="0">
+      <w:start w:val="1"/>
+      <w:numFmt w:val="bullet"/>
+      <w:lvlText w:val=""/>
+      <w:lvlJc w:val="left"/>
+      <w:pPr>
+        <w:tabs>
+          <w:tab w:val="num" w:pos="720"/>
+        </w:tabs>
+        <w:ind w:left="720" w:hanging="360"/>
+      </w:pPr>
+      <w:rPr>
+        <w:rFonts w:ascii="Symbol" w:hAnsi="Symbol" w:hint="default"/>
+        <w:sz w:val="20"/>
+      </w:rPr>
+    </w:lvl>
+    <w:lvl w:ilvl="1" w:tentative="1">
+      <w:start w:val="1"/>
+      <w:numFmt w:val="bullet"/>
+      <w:lvlText w:val="o"/>
+      <w:lvlJc w:val="left"/>
+      <w:pPr>
+        <w:tabs>
+          <w:tab w:val="num" w:pos="1440"/>
+        </w:tabs>
+        <w:ind w:left="1440" w:hanging="360"/>
+      </w:pPr>
+      <w:rPr>
+        <w:rFonts w:ascii="Courier New" w:hAnsi="Courier New" w:hint="default"/>
+        <w:sz w:val="20"/>
+      </w:rPr>
+    </w:lvl>
+    <w:lvl w:ilvl="2" w:tentative="1">
+      <w:start w:val="1"/>
+      <w:numFmt w:val="bullet"/>
+      <w:lvlText w:val=""/>
+      <w:lvlJc w:val="left"/>
+      <w:pPr>
+        <w:tabs>
+          <w:tab w:val="num" w:pos="2160"/>
+        </w:tabs>
+        <w:ind w:left="2160" w:hanging="360"/>
+      </w:pPr>
+      <w:rPr>
+        <w:rFonts w:ascii="Wingdings" w:hAnsi="Wingdings" w:hint="default"/>
+        <w:sz w:val="20"/>
+      </w:rPr>
+    </w:lvl>
+    <w:lvl w:ilvl="3" w:tentative="1">
+      <w:start w:val="1"/>
+      <w:numFmt w:val="bullet"/>
+      <w:lvlText w:val=""/>
+      <w:lvlJc w:val="left"/>
+      <w:pPr>
+        <w:tabs>
+          <w:tab w:val="num" w:pos="2880"/>
+        </w:tabs>
+        <w:ind w:left="2880" w:hanging="360"/>
+      </w:pPr>
+      <w:rPr>
+        <w:rFonts w:ascii="Wingdings" w:hAnsi="Wingdings" w:hint="default"/>
+        <w:sz w:val="20"/>
+      </w:rPr>
+    </w:lvl>
+    <w:lvl w:ilvl="4" w:tentative="1">
+      <w:start w:val="1"/>
+      <w:numFmt w:val="bullet"/>
+      <w:lvlText w:val=""/>
+      <w:lvlJc w:val="left"/>
+      <w:pPr>
+        <w:tabs>
+          <w:tab w:val="num" w:pos="3600"/>
+        </w:tabs>
+        <w:ind w:left="3600" w:hanging="360"/>
+      </w:pPr>
+      <w:rPr>
+        <w:rFonts w:ascii="Wingdings" w:hAnsi="Wingdings" w:hint="default"/>
+        <w:sz w:val="20"/>
+      </w:rPr>
+    </w:lvl>
+    <w:lvl w:ilvl="5" w:tentative="1">
+      <w:start w:val="1"/>
+      <w:numFmt w:val="bullet"/>
+      <w:lvlText w:val=""/>
+      <w:lvlJc w:val="left"/>
+      <w:pPr>
+        <w:tabs>
+          <w:tab w:val="num" w:pos="4320"/>
+        </w:tabs>
+        <w:ind w:left="4320" w:hanging="360"/>
+      </w:pPr>
+      <w:rPr>
+        <w:rFonts w:ascii="Wingdings" w:hAnsi="Wingdings" w:hint="default"/>
+        <w:sz w:val="20"/>
+      </w:rPr>
+    </w:lvl>
+    <w:lvl w:ilvl="6" w:tentative="1">
+      <w:start w:val="1"/>
+      <w:numFmt w:val="bullet"/>
+      <w:lvlText w:val=""/>
+      <w:lvlJc w:val="left"/>
+      <w:pPr>
+        <w:tabs>
+          <w:tab w:val="num" w:pos="5040"/>
+        </w:tabs>
+        <w:ind w:left="5040" w:hanging="360"/>
+      </w:pPr>
+      <w:rPr>
+        <w:rFonts w:ascii="Wingdings" w:hAnsi="Wingdings" w:hint="default"/>
+        <w:sz w:val="20"/>
+      </w:rPr>
+    </w:lvl>
+    <w:lvl w:ilvl="7" w:tentative="1">
+      <w:start w:val="1"/>
+      <w:numFmt w:val="bullet"/>
+      <w:lvlText w:val=""/>
+      <w:lvlJc w:val="left"/>
+      <w:pPr>
+        <w:tabs>
+          <w:tab w:val="num" w:pos="5760"/>
+        </w:tabs>
+        <w:ind w:left="5760" w:hanging="360"/>
+      </w:pPr>
+      <w:rPr>
+        <w:rFonts w:ascii="Wingdings" w:hAnsi="Wingdings" w:hint="default"/>
+        <w:sz w:val="20"/>
+      </w:rPr>
+    </w:lvl>
+    <w:lvl w:ilvl="8" w:tentative="1">
+      <w:start w:val="1"/>
+      <w:numFmt w:val="bullet"/>
+      <w:lvlText w:val=""/>
+      <w:lvlJc w:val="left"/>
+      <w:pPr>
+        <w:tabs>
+          <w:tab w:val="num" w:pos="6480"/>
+        </w:tabs>
+        <w:ind w:left="6480" w:hanging="360"/>
+      </w:pPr>
+      <w:rPr>
+        <w:rFonts w:ascii="Wingdings" w:hAnsi="Wingdings" w:hint="default"/>
+        <w:sz w:val="20"/>
+      </w:rPr>
+    </w:lvl>
+  </w:abstractNum>
+  <w:abstractNum w:abstractNumId="2" w15:restartNumberingAfterBreak="0">
+    <w:nsid w:val="2D083C72"/>
+    <w:multiLevelType w:val="multilevel"/>
+    <w:tmpl w:val="4ADAEF00"/>
+    <w:lvl w:ilvl="0">
+      <w:start w:val="1"/>
+      <w:numFmt w:val="bullet"/>
+      <w:lvlText w:val=""/>
+      <w:lvlJc w:val="left"/>
+      <w:pPr>
+        <w:tabs>
+          <w:tab w:val="num" w:pos="720"/>
+        </w:tabs>
+        <w:ind w:left="720" w:hanging="360"/>
+      </w:pPr>
+      <w:rPr>
+        <w:rFonts w:ascii="Symbol" w:hAnsi="Symbol" w:hint="default"/>
+        <w:sz w:val="20"/>
+      </w:rPr>
+    </w:lvl>
+    <w:lvl w:ilvl="1" w:tentative="1">
+      <w:start w:val="1"/>
+      <w:numFmt w:val="bullet"/>
+      <w:lvlText w:val="o"/>
+      <w:lvlJc w:val="left"/>
+      <w:pPr>
+        <w:tabs>
+          <w:tab w:val="num" w:pos="1440"/>
+        </w:tabs>
+        <w:ind w:left="1440" w:hanging="360"/>
+      </w:pPr>
+      <w:rPr>
+        <w:rFonts w:ascii="Courier New" w:hAnsi="Courier New" w:hint="default"/>
+        <w:sz w:val="20"/>
+      </w:rPr>
+    </w:lvl>
+    <w:lvl w:ilvl="2" w:tentative="1">
+      <w:start w:val="1"/>
+      <w:numFmt w:val="bullet"/>
+      <w:lvlText w:val=""/>
+      <w:lvlJc w:val="left"/>
+      <w:pPr>
+        <w:tabs>
+          <w:tab w:val="num" w:pos="2160"/>
+        </w:tabs>
+        <w:ind w:left="2160" w:hanging="360"/>
+      </w:pPr>
+      <w:rPr>
+        <w:rFonts w:ascii="Wingdings" w:hAnsi="Wingdings" w:hint="default"/>
+        <w:sz w:val="20"/>
+      </w:rPr>
+    </w:lvl>
+    <w:lvl w:ilvl="3" w:tentative="1">
+      <w:start w:val="1"/>
+      <w:numFmt w:val="bullet"/>
+      <w:lvlText w:val=""/>
+      <w:lvlJc w:val="left"/>
+      <w:pPr>
+        <w:tabs>
+          <w:tab w:val="num" w:pos="2880"/>
+        </w:tabs>
+        <w:ind w:left="2880" w:hanging="360"/>
+      </w:pPr>
+      <w:rPr>
+        <w:rFonts w:ascii="Wingdings" w:hAnsi="Wingdings" w:hint="default"/>
+        <w:sz w:val="20"/>
+      </w:rPr>
+    </w:lvl>
+    <w:lvl w:ilvl="4" w:tentative="1">
+      <w:start w:val="1"/>
+      <w:numFmt w:val="bullet"/>
+      <w:lvlText w:val=""/>
+      <w:lvlJc w:val="left"/>
+      <w:pPr>
+        <w:tabs>
+          <w:tab w:val="num" w:pos="3600"/>
+        </w:tabs>
+        <w:ind w:left="3600" w:hanging="360"/>
+      </w:pPr>
+      <w:rPr>
+        <w:rFonts w:ascii="Wingdings" w:hAnsi="Wingdings" w:hint="default"/>
+        <w:sz w:val="20"/>
+      </w:rPr>
+    </w:lvl>
+    <w:lvl w:ilvl="5" w:tentative="1">
+      <w:start w:val="1"/>
+      <w:numFmt w:val="bullet"/>
+      <w:lvlText w:val=""/>
+      <w:lvlJc w:val="left"/>
+      <w:pPr>
+        <w:tabs>
+          <w:tab w:val="num" w:pos="4320"/>
+        </w:tabs>
+        <w:ind w:left="4320" w:hanging="360"/>
+      </w:pPr>
+      <w:rPr>
+        <w:rFonts w:ascii="Wingdings" w:hAnsi="Wingdings" w:hint="default"/>
+        <w:sz w:val="20"/>
+      </w:rPr>
+    </w:lvl>
+    <w:lvl w:ilvl="6" w:tentative="1">
+      <w:start w:val="1"/>
+      <w:numFmt w:val="bullet"/>
+      <w:lvlText w:val=""/>
+      <w:lvlJc w:val="left"/>
+      <w:pPr>
+        <w:tabs>
+          <w:tab w:val="num" w:pos="5040"/>
+        </w:tabs>
+        <w:ind w:left="5040" w:hanging="360"/>
+      </w:pPr>
+      <w:rPr>
+        <w:rFonts w:ascii="Wingdings" w:hAnsi="Wingdings" w:hint="default"/>
+        <w:sz w:val="20"/>
+      </w:rPr>
+    </w:lvl>
+    <w:lvl w:ilvl="7" w:tentative="1">
+      <w:start w:val="1"/>
+      <w:numFmt w:val="bullet"/>
+      <w:lvlText w:val=""/>
+      <w:lvlJc w:val="left"/>
+      <w:pPr>
+        <w:tabs>
+          <w:tab w:val="num" w:pos="5760"/>
+        </w:tabs>
+        <w:ind w:left="5760" w:hanging="360"/>
+      </w:pPr>
+      <w:rPr>
+        <w:rFonts w:ascii="Wingdings" w:hAnsi="Wingdings" w:hint="default"/>
+        <w:sz w:val="20"/>
+      </w:rPr>
+    </w:lvl>
+    <w:lvl w:ilvl="8" w:tentative="1">
+      <w:start w:val="1"/>
+      <w:numFmt w:val="bullet"/>
+      <w:lvlText w:val=""/>
+      <w:lvlJc w:val="left"/>
+      <w:pPr>
+        <w:tabs>
+          <w:tab w:val="num" w:pos="6480"/>
+        </w:tabs>
+        <w:ind w:left="6480" w:hanging="360"/>
+      </w:pPr>
+      <w:rPr>
+        <w:rFonts w:ascii="Wingdings" w:hAnsi="Wingdings" w:hint="default"/>
+        <w:sz w:val="20"/>
+      </w:rPr>
+    </w:lvl>
+  </w:abstractNum>
+  <w:abstractNum w:abstractNumId="3" w15:restartNumberingAfterBreak="0">
+    <w:nsid w:val="3F137A4D"/>
+    <w:multiLevelType w:val="multilevel"/>
+    <w:tmpl w:val="7326D258"/>
+    <w:lvl w:ilvl="0">
+      <w:start w:val="1"/>
+      <w:numFmt w:val="bullet"/>
+      <w:lvlText w:val=""/>
+      <w:lvlJc w:val="left"/>
+      <w:pPr>
+        <w:tabs>
+          <w:tab w:val="num" w:pos="720"/>
+        </w:tabs>
+        <w:ind w:left="720" w:hanging="360"/>
+      </w:pPr>
+      <w:rPr>
+        <w:rFonts w:ascii="Symbol" w:hAnsi="Symbol" w:hint="default"/>
+        <w:sz w:val="20"/>
+      </w:rPr>
+    </w:lvl>
+    <w:lvl w:ilvl="1" w:tentative="1">
+      <w:start w:val="1"/>
+      <w:numFmt w:val="bullet"/>
+      <w:lvlText w:val="o"/>
+      <w:lvlJc w:val="left"/>
+      <w:pPr>
+        <w:tabs>
+          <w:tab w:val="num" w:pos="1440"/>
+        </w:tabs>
+        <w:ind w:left="1440" w:hanging="360"/>
+      </w:pPr>
+      <w:rPr>
+        <w:rFonts w:ascii="Courier New" w:hAnsi="Courier New" w:hint="default"/>
+        <w:sz w:val="20"/>
+      </w:rPr>
+    </w:lvl>
+    <w:lvl w:ilvl="2" w:tentative="1">
+      <w:start w:val="1"/>
+      <w:numFmt w:val="bullet"/>
+      <w:lvlText w:val=""/>
+      <w:lvlJc w:val="left"/>
+      <w:pPr>
+        <w:tabs>
+          <w:tab w:val="num" w:pos="2160"/>
+        </w:tabs>
+        <w:ind w:left="2160" w:hanging="360"/>
+      </w:pPr>
+      <w:rPr>
+        <w:rFonts w:ascii="Wingdings" w:hAnsi="Wingdings" w:hint="default"/>
+        <w:sz w:val="20"/>
+      </w:rPr>
+    </w:lvl>
+    <w:lvl w:ilvl="3" w:tentative="1">
+      <w:start w:val="1"/>
+      <w:numFmt w:val="bullet"/>
+      <w:lvlText w:val=""/>
+      <w:lvlJc w:val="left"/>
+      <w:pPr>
+        <w:tabs>
+          <w:tab w:val="num" w:pos="2880"/>
+        </w:tabs>
+        <w:ind w:left="2880" w:hanging="360"/>
+      </w:pPr>
+      <w:rPr>
+        <w:rFonts w:ascii="Wingdings" w:hAnsi="Wingdings" w:hint="default"/>
+        <w:sz w:val="20"/>
+      </w:rPr>
+    </w:lvl>
+    <w:lvl w:ilvl="4" w:tentative="1">
+      <w:start w:val="1"/>
+      <w:numFmt w:val="bullet"/>
+      <w:lvlText w:val=""/>
+      <w:lvlJc w:val="left"/>
+      <w:pPr>
+        <w:tabs>
+          <w:tab w:val="num" w:pos="3600"/>
+        </w:tabs>
+        <w:ind w:left="3600" w:hanging="360"/>
+      </w:pPr>
+      <w:rPr>
+        <w:rFonts w:ascii="Wingdings" w:hAnsi="Wingdings" w:hint="default"/>
+        <w:sz w:val="20"/>
+      </w:rPr>
+    </w:lvl>
+    <w:lvl w:ilvl="5" w:tentative="1">
+      <w:start w:val="1"/>
+      <w:numFmt w:val="bullet"/>
+      <w:lvlText w:val=""/>
+      <w:lvlJc w:val="left"/>
+      <w:pPr>
+        <w:tabs>
+          <w:tab w:val="num" w:pos="4320"/>
+        </w:tabs>
+        <w:ind w:left="4320" w:hanging="360"/>
+      </w:pPr>
+      <w:rPr>
+        <w:rFonts w:ascii="Wingdings" w:hAnsi="Wingdings" w:hint="default"/>
+        <w:sz w:val="20"/>
+      </w:rPr>
+    </w:lvl>
+    <w:lvl w:ilvl="6" w:tentative="1">
+      <w:start w:val="1"/>
+      <w:numFmt w:val="bullet"/>
+      <w:lvlText w:val=""/>
+      <w:lvlJc w:val="left"/>
+      <w:pPr>
+        <w:tabs>
+          <w:tab w:val="num" w:pos="5040"/>
+        </w:tabs>
+        <w:ind w:left="5040" w:hanging="360"/>
+      </w:pPr>
+      <w:rPr>
+        <w:rFonts w:ascii="Wingdings" w:hAnsi="Wingdings" w:hint="default"/>
+        <w:sz w:val="20"/>
+      </w:rPr>
+    </w:lvl>
+    <w:lvl w:ilvl="7" w:tentative="1">
+      <w:start w:val="1"/>
+      <w:numFmt w:val="bullet"/>
+      <w:lvlText w:val=""/>
+      <w:lvlJc w:val="left"/>
+      <w:pPr>
+        <w:tabs>
+          <w:tab w:val="num" w:pos="5760"/>
+        </w:tabs>
+        <w:ind w:left="5760" w:hanging="360"/>
+      </w:pPr>
+      <w:rPr>
+        <w:rFonts w:ascii="Wingdings" w:hAnsi="Wingdings" w:hint="default"/>
+        <w:sz w:val="20"/>
+      </w:rPr>
+    </w:lvl>
+    <w:lvl w:ilvl="8" w:tentative="1">
+      <w:start w:val="1"/>
+      <w:numFmt w:val="bullet"/>
+      <w:lvlText w:val=""/>
+      <w:lvlJc w:val="left"/>
+      <w:pPr>
+        <w:tabs>
+          <w:tab w:val="num" w:pos="6480"/>
+        </w:tabs>
+        <w:ind w:left="6480" w:hanging="360"/>
+      </w:pPr>
+      <w:rPr>
+        <w:rFonts w:ascii="Wingdings" w:hAnsi="Wingdings" w:hint="default"/>
+        <w:sz w:val="20"/>
+      </w:rPr>
+    </w:lvl>
+  </w:abstractNum>
+  <w:abstractNum w:abstractNumId="4" w15:restartNumberingAfterBreak="0">
+    <w:nsid w:val="5804509C"/>
+    <w:multiLevelType w:val="multilevel"/>
+    <w:tmpl w:val="7C5A0912"/>
+    <w:lvl w:ilvl="0">
+      <w:start w:val="1"/>
+      <w:numFmt w:val="bullet"/>
+      <w:lvlText w:val=""/>
+      <w:lvlJc w:val="left"/>
+      <w:pPr>
+        <w:tabs>
+          <w:tab w:val="num" w:pos="720"/>
+        </w:tabs>
+        <w:ind w:left="720" w:hanging="360"/>
+      </w:pPr>
+      <w:rPr>
+        <w:rFonts w:ascii="Symbol" w:hAnsi="Symbol" w:hint="default"/>
+        <w:sz w:val="20"/>
+      </w:rPr>
+    </w:lvl>
+    <w:lvl w:ilvl="1" w:tentative="1">
+      <w:start w:val="1"/>
+      <w:numFmt w:val="bullet"/>
+      <w:lvlText w:val="o"/>
+      <w:lvlJc w:val="left"/>
+      <w:pPr>
+        <w:tabs>
+          <w:tab w:val="num" w:pos="1440"/>
+        </w:tabs>
+        <w:ind w:left="1440" w:hanging="360"/>
+      </w:pPr>
+      <w:rPr>
+        <w:rFonts w:ascii="Courier New" w:hAnsi="Courier New" w:hint="default"/>
+        <w:sz w:val="20"/>
+      </w:rPr>
+    </w:lvl>
+    <w:lvl w:ilvl="2" w:tentative="1">
+      <w:start w:val="1"/>
+      <w:numFmt w:val="bullet"/>
+      <w:lvlText w:val=""/>
+      <w:lvlJc w:val="left"/>
+      <w:pPr>
+        <w:tabs>
+          <w:tab w:val="num" w:pos="2160"/>
+        </w:tabs>
+        <w:ind w:left="2160" w:hanging="360"/>
+      </w:pPr>
+      <w:rPr>
+        <w:rFonts w:ascii="Wingdings" w:hAnsi="Wingdings" w:hint="default"/>
+        <w:sz w:val="20"/>
+      </w:rPr>
+    </w:lvl>
+    <w:lvl w:ilvl="3" w:tentative="1">
+      <w:start w:val="1"/>
+      <w:numFmt w:val="bullet"/>
+      <w:lvlText w:val=""/>
+      <w:lvlJc w:val="left"/>
+      <w:pPr>
+        <w:tabs>
+          <w:tab w:val="num" w:pos="2880"/>
+        </w:tabs>
+        <w:ind w:left="2880" w:hanging="360"/>
+      </w:pPr>
+      <w:rPr>
+        <w:rFonts w:ascii="Wingdings" w:hAnsi="Wingdings" w:hint="default"/>
+        <w:sz w:val="20"/>
+      </w:rPr>
+    </w:lvl>
+    <w:lvl w:ilvl="4" w:tentative="1">
+      <w:start w:val="1"/>
+      <w:numFmt w:val="bullet"/>
+      <w:lvlText w:val=""/>
+      <w:lvlJc w:val="left"/>
+      <w:pPr>
+        <w:tabs>
+          <w:tab w:val="num" w:pos="3600"/>
+        </w:tabs>
+        <w:ind w:left="3600" w:hanging="360"/>
+      </w:pPr>
+      <w:rPr>
+        <w:rFonts w:ascii="Wingdings" w:hAnsi="Wingdings" w:hint="default"/>
+        <w:sz w:val="20"/>
+      </w:rPr>
+    </w:lvl>
+    <w:lvl w:ilvl="5" w:tentative="1">
+      <w:start w:val="1"/>
+      <w:numFmt w:val="bullet"/>
+      <w:lvlText w:val=""/>
+      <w:lvlJc w:val="left"/>
+      <w:pPr>
+        <w:tabs>
+          <w:tab w:val="num" w:pos="4320"/>
+        </w:tabs>
+        <w:ind w:left="4320" w:hanging="360"/>
+      </w:pPr>
+      <w:rPr>
+        <w:rFonts w:ascii="Wingdings" w:hAnsi="Wingdings" w:hint="default"/>
+        <w:sz w:val="20"/>
+      </w:rPr>
+    </w:lvl>
+    <w:lvl w:ilvl="6" w:tentative="1">
+      <w:start w:val="1"/>
+      <w:numFmt w:val="bullet"/>
+      <w:lvlText w:val=""/>
+      <w:lvlJc w:val="left"/>
+      <w:pPr>
+        <w:tabs>
+          <w:tab w:val="num" w:pos="5040"/>
+        </w:tabs>
+        <w:ind w:left="5040" w:hanging="360"/>
+      </w:pPr>
+      <w:rPr>
+        <w:rFonts w:ascii="Wingdings" w:hAnsi="Wingdings" w:hint="default"/>
+        <w:sz w:val="20"/>
+      </w:rPr>
+    </w:lvl>
+    <w:lvl w:ilvl="7" w:tentative="1">
+      <w:start w:val="1"/>
+      <w:numFmt w:val="bullet"/>
+      <w:lvlText w:val=""/>
+      <w:lvlJc w:val="left"/>
+      <w:pPr>
+        <w:tabs>
+          <w:tab w:val="num" w:pos="5760"/>
+        </w:tabs>
+        <w:ind w:left="5760" w:hanging="360"/>
+      </w:pPr>
+      <w:rPr>
+        <w:rFonts w:ascii="Wingdings" w:hAnsi="Wingdings" w:hint="default"/>
+        <w:sz w:val="20"/>
+      </w:rPr>
+    </w:lvl>
+    <w:lvl w:ilvl="8" w:tentative="1">
+      <w:start w:val="1"/>
+      <w:numFmt w:val="bullet"/>
+      <w:lvlText w:val=""/>
+      <w:lvlJc w:val="left"/>
+      <w:pPr>
+        <w:tabs>
+          <w:tab w:val="num" w:pos="6480"/>
+        </w:tabs>
+        <w:ind w:left="6480" w:hanging="360"/>
+      </w:pPr>
+      <w:rPr>
+        <w:rFonts w:ascii="Wingdings" w:hAnsi="Wingdings" w:hint="default"/>
+        <w:sz w:val="20"/>
+      </w:rPr>
+    </w:lvl>
+  </w:abstractNum>
+  <w:abstractNum w:abstractNumId="5" w15:restartNumberingAfterBreak="0">
+    <w:nsid w:val="5AAB25B5"/>
+    <w:multiLevelType w:val="multilevel"/>
+    <w:tmpl w:val="7236F5CA"/>
+    <w:lvl w:ilvl="0">
+      <w:start w:val="1"/>
+      <w:numFmt w:val="bullet"/>
+      <w:lvlText w:val=""/>
+      <w:lvlJc w:val="left"/>
+      <w:pPr>
+        <w:tabs>
+          <w:tab w:val="num" w:pos="720"/>
+        </w:tabs>
+        <w:ind w:left="720" w:hanging="360"/>
+      </w:pPr>
+      <w:rPr>
+        <w:rFonts w:ascii="Symbol" w:hAnsi="Symbol" w:hint="default"/>
+        <w:sz w:val="20"/>
+      </w:rPr>
+    </w:lvl>
+    <w:lvl w:ilvl="1" w:tentative="1">
+      <w:start w:val="1"/>
+      <w:numFmt w:val="bullet"/>
+      <w:lvlText w:val="o"/>
+      <w:lvlJc w:val="left"/>
+      <w:pPr>
+        <w:tabs>
+          <w:tab w:val="num" w:pos="1440"/>
+        </w:tabs>
+        <w:ind w:left="1440" w:hanging="360"/>
+      </w:pPr>
+      <w:rPr>
+        <w:rFonts w:ascii="Courier New" w:hAnsi="Courier New" w:hint="default"/>
+        <w:sz w:val="20"/>
+      </w:rPr>
+    </w:lvl>
+    <w:lvl w:ilvl="2" w:tentative="1">
+      <w:start w:val="1"/>
+      <w:numFmt w:val="bullet"/>
+      <w:lvlText w:val=""/>
+      <w:lvlJc w:val="left"/>
+      <w:pPr>
+        <w:tabs>
+          <w:tab w:val="num" w:pos="2160"/>
+        </w:tabs>
+        <w:ind w:left="2160" w:hanging="360"/>
+      </w:pPr>
+      <w:rPr>
+        <w:rFonts w:ascii="Wingdings" w:hAnsi="Wingdings" w:hint="default"/>
+        <w:sz w:val="20"/>
+      </w:rPr>
+    </w:lvl>
+    <w:lvl w:ilvl="3" w:tentative="1">
+      <w:start w:val="1"/>
+      <w:numFmt w:val="bullet"/>
+      <w:lvlText w:val=""/>
+      <w:lvlJc w:val="left"/>
+      <w:pPr>
+        <w:tabs>
+          <w:tab w:val="num" w:pos="2880"/>
+        </w:tabs>
+        <w:ind w:left="2880" w:hanging="360"/>
+      </w:pPr>
+      <w:rPr>
+        <w:rFonts w:ascii="Wingdings" w:hAnsi="Wingdings" w:hint="default"/>
+        <w:sz w:val="20"/>
+      </w:rPr>
+    </w:lvl>
+    <w:lvl w:ilvl="4" w:tentative="1">
+      <w:start w:val="1"/>
+      <w:numFmt w:val="bullet"/>
+      <w:lvlText w:val=""/>
+      <w:lvlJc w:val="left"/>
+      <w:pPr>
+        <w:tabs>
+          <w:tab w:val="num" w:pos="3600"/>
+        </w:tabs>
+        <w:ind w:left="3600" w:hanging="360"/>
+      </w:pPr>
+      <w:rPr>
+        <w:rFonts w:ascii="Wingdings" w:hAnsi="Wingdings" w:hint="default"/>
+        <w:sz w:val="20"/>
+      </w:rPr>
+    </w:lvl>
+    <w:lvl w:ilvl="5" w:tentative="1">
+      <w:start w:val="1"/>
+      <w:numFmt w:val="bullet"/>
+      <w:lvlText w:val=""/>
+      <w:lvlJc w:val="left"/>
+      <w:pPr>
+        <w:tabs>
+          <w:tab w:val="num" w:pos="4320"/>
+        </w:tabs>
+        <w:ind w:left="4320" w:hanging="360"/>
+      </w:pPr>
+      <w:rPr>
+        <w:rFonts w:ascii="Wingdings" w:hAnsi="Wingdings" w:hint="default"/>
+        <w:sz w:val="20"/>
+      </w:rPr>
+    </w:lvl>
+    <w:lvl w:ilvl="6" w:tentative="1">
+      <w:start w:val="1"/>
+      <w:numFmt w:val="bullet"/>
+      <w:lvlText w:val=""/>
+      <w:lvlJc w:val="left"/>
+      <w:pPr>
+        <w:tabs>
+          <w:tab w:val="num" w:pos="5040"/>
+        </w:tabs>
+        <w:ind w:left="5040" w:hanging="360"/>
+      </w:pPr>
+      <w:rPr>
+        <w:rFonts w:ascii="Wingdings" w:hAnsi="Wingdings" w:hint="default"/>
+        <w:sz w:val="20"/>
+      </w:rPr>
+    </w:lvl>
+    <w:lvl w:ilvl="7" w:tentative="1">
+      <w:start w:val="1"/>
+      <w:numFmt w:val="bullet"/>
+      <w:lvlText w:val=""/>
+      <w:lvlJc w:val="left"/>
+      <w:pPr>
+        <w:tabs>
+          <w:tab w:val="num" w:pos="5760"/>
+        </w:tabs>
+        <w:ind w:left="5760" w:hanging="360"/>
+      </w:pPr>
+      <w:rPr>
+        <w:rFonts w:ascii="Wingdings" w:hAnsi="Wingdings" w:hint="default"/>
+        <w:sz w:val="20"/>
+      </w:rPr>
+    </w:lvl>
+    <w:lvl w:ilvl="8" w:tentative="1">
+      <w:start w:val="1"/>
+      <w:numFmt w:val="bullet"/>
+      <w:lvlText w:val=""/>
+      <w:lvlJc w:val="left"/>
+      <w:pPr>
+        <w:tabs>
+          <w:tab w:val="num" w:pos="6480"/>
+        </w:tabs>
+        <w:ind w:left="6480" w:hanging="360"/>
+      </w:pPr>
+      <w:rPr>
+        <w:rFonts w:ascii="Wingdings" w:hAnsi="Wingdings" w:hint="default"/>
+        <w:sz w:val="20"/>
+      </w:rPr>
+    </w:lvl>
+  </w:abstractNum>
+  <w:abstractNum w:abstractNumId="6" w15:restartNumberingAfterBreak="0">
+    <w:nsid w:val="5F3C5130"/>
+    <w:multiLevelType w:val="multilevel"/>
+    <w:tmpl w:val="DC9AA11C"/>
+    <w:lvl w:ilvl="0">
+      <w:start w:val="1"/>
+      <w:numFmt w:val="bullet"/>
+      <w:lvlText w:val=""/>
+      <w:lvlJc w:val="left"/>
+      <w:pPr>
+        <w:tabs>
+          <w:tab w:val="num" w:pos="720"/>
+        </w:tabs>
+        <w:ind w:left="720" w:hanging="360"/>
+      </w:pPr>
+      <w:rPr>
+        <w:rFonts w:ascii="Symbol" w:hAnsi="Symbol" w:hint="default"/>
+        <w:sz w:val="20"/>
+      </w:rPr>
+    </w:lvl>
+    <w:lvl w:ilvl="1" w:tentative="1">
+      <w:start w:val="1"/>
+      <w:numFmt w:val="bullet"/>
+      <w:lvlText w:val="o"/>
+      <w:lvlJc w:val="left"/>
+      <w:pPr>
+        <w:tabs>
+          <w:tab w:val="num" w:pos="1440"/>
+        </w:tabs>
+        <w:ind w:left="1440" w:hanging="360"/>
+      </w:pPr>
+      <w:rPr>
+        <w:rFonts w:ascii="Courier New" w:hAnsi="Courier New" w:hint="default"/>
+        <w:sz w:val="20"/>
+      </w:rPr>
+    </w:lvl>
+    <w:lvl w:ilvl="2" w:tentative="1">
+      <w:start w:val="1"/>
+      <w:numFmt w:val="bullet"/>
+      <w:lvlText w:val=""/>
+      <w:lvlJc w:val="left"/>
+      <w:pPr>
+        <w:tabs>
+          <w:tab w:val="num" w:pos="2160"/>
+        </w:tabs>
+        <w:ind w:left="2160" w:hanging="360"/>
+      </w:pPr>
+      <w:rPr>
+        <w:rFonts w:ascii="Wingdings" w:hAnsi="Wingdings" w:hint="default"/>
+        <w:sz w:val="20"/>
+      </w:rPr>
+    </w:lvl>
+    <w:lvl w:ilvl="3" w:tentative="1">
+      <w:start w:val="1"/>
+      <w:numFmt w:val="bullet"/>
+      <w:lvlText w:val=""/>
+      <w:lvlJc w:val="left"/>
+      <w:pPr>
+        <w:tabs>
+          <w:tab w:val="num" w:pos="2880"/>
+        </w:tabs>
+        <w:ind w:left="2880" w:hanging="360"/>
+      </w:pPr>
+      <w:rPr>
+        <w:rFonts w:ascii="Wingdings" w:hAnsi="Wingdings" w:hint="default"/>
+        <w:sz w:val="20"/>
+      </w:rPr>
+    </w:lvl>
+    <w:lvl w:ilvl="4" w:tentative="1">
+      <w:start w:val="1"/>
+      <w:numFmt w:val="bullet"/>
+      <w:lvlText w:val=""/>
+      <w:lvlJc w:val="left"/>
+      <w:pPr>
+        <w:tabs>
+          <w:tab w:val="num" w:pos="3600"/>
+        </w:tabs>
+        <w:ind w:left="3600" w:hanging="360"/>
+      </w:pPr>
+      <w:rPr>
+        <w:rFonts w:ascii="Wingdings" w:hAnsi="Wingdings" w:hint="default"/>
+        <w:sz w:val="20"/>
+      </w:rPr>
+    </w:lvl>
+    <w:lvl w:ilvl="5" w:tentative="1">
+      <w:start w:val="1"/>
+      <w:numFmt w:val="bullet"/>
+      <w:lvlText w:val=""/>
+      <w:lvlJc w:val="left"/>
+      <w:pPr>
+        <w:tabs>
+          <w:tab w:val="num" w:pos="4320"/>
+        </w:tabs>
+        <w:ind w:left="4320" w:hanging="360"/>
+      </w:pPr>
+      <w:rPr>
+        <w:rFonts w:ascii="Wingdings" w:hAnsi="Wingdings" w:hint="default"/>
+        <w:sz w:val="20"/>
+      </w:rPr>
+    </w:lvl>
+    <w:lvl w:ilvl="6" w:tentative="1">
+      <w:start w:val="1"/>
+      <w:numFmt w:val="bullet"/>
+      <w:lvlText w:val=""/>
+      <w:lvlJc w:val="left"/>
+      <w:pPr>
+        <w:tabs>
+          <w:tab w:val="num" w:pos="5040"/>
+        </w:tabs>
+        <w:ind w:left="5040" w:hanging="360"/>
+      </w:pPr>
+      <w:rPr>
+        <w:rFonts w:ascii="Wingdings" w:hAnsi="Wingdings" w:hint="default"/>
+        <w:sz w:val="20"/>
+      </w:rPr>
+    </w:lvl>
+    <w:lvl w:ilvl="7" w:tentative="1">
+      <w:start w:val="1"/>
+      <w:numFmt w:val="bullet"/>
+      <w:lvlText w:val=""/>
+      <w:lvlJc w:val="left"/>
+      <w:pPr>
+        <w:tabs>
+          <w:tab w:val="num" w:pos="5760"/>
+        </w:tabs>
+        <w:ind w:left="5760" w:hanging="360"/>
+      </w:pPr>
+      <w:rPr>
+        <w:rFonts w:ascii="Wingdings" w:hAnsi="Wingdings" w:hint="default"/>
+        <w:sz w:val="20"/>
+      </w:rPr>
+    </w:lvl>
+    <w:lvl w:ilvl="8" w:tentative="1">
+      <w:start w:val="1"/>
+      <w:numFmt w:val="bullet"/>
+      <w:lvlText w:val=""/>
+      <w:lvlJc w:val="left"/>
+      <w:pPr>
+        <w:tabs>
+          <w:tab w:val="num" w:pos="6480"/>
+        </w:tabs>
+        <w:ind w:left="6480" w:hanging="360"/>
+      </w:pPr>
+      <w:rPr>
+        <w:rFonts w:ascii="Wingdings" w:hAnsi="Wingdings" w:hint="default"/>
+        <w:sz w:val="20"/>
+      </w:rPr>
+    </w:lvl>
+  </w:abstractNum>
+  <w:abstractNum w:abstractNumId="7" w15:restartNumberingAfterBreak="0">
+    <w:nsid w:val="72B12E7D"/>
+    <w:multiLevelType w:val="multilevel"/>
+    <w:tmpl w:val="55BEC34C"/>
+    <w:lvl w:ilvl="0">
+      <w:start w:val="1"/>
+      <w:numFmt w:val="bullet"/>
+      <w:lvlText w:val=""/>
+      <w:lvlJc w:val="left"/>
+      <w:pPr>
+        <w:tabs>
+          <w:tab w:val="num" w:pos="720"/>
+        </w:tabs>
+        <w:ind w:left="720" w:hanging="360"/>
+      </w:pPr>
+      <w:rPr>
+        <w:rFonts w:ascii="Symbol" w:hAnsi="Symbol" w:hint="default"/>
+        <w:sz w:val="20"/>
+      </w:rPr>
+    </w:lvl>
+    <w:lvl w:ilvl="1" w:tentative="1">
+      <w:start w:val="1"/>
+      <w:numFmt w:val="bullet"/>
+      <w:lvlText w:val="o"/>
+      <w:lvlJc w:val="left"/>
+      <w:pPr>
+        <w:tabs>
+          <w:tab w:val="num" w:pos="1440"/>
+        </w:tabs>
+        <w:ind w:left="1440" w:hanging="360"/>
+      </w:pPr>
+      <w:rPr>
+        <w:rFonts w:ascii="Courier New" w:hAnsi="Courier New" w:hint="default"/>
+        <w:sz w:val="20"/>
+      </w:rPr>
+    </w:lvl>
+    <w:lvl w:ilvl="2" w:tentative="1">
+      <w:start w:val="1"/>
+      <w:numFmt w:val="bullet"/>
+      <w:lvlText w:val=""/>
+      <w:lvlJc w:val="left"/>
+      <w:pPr>
+        <w:tabs>
+          <w:tab w:val="num" w:pos="2160"/>
+        </w:tabs>
+        <w:ind w:left="2160" w:hanging="360"/>
+      </w:pPr>
+      <w:rPr>
+        <w:rFonts w:ascii="Wingdings" w:hAnsi="Wingdings" w:hint="default"/>
+        <w:sz w:val="20"/>
+      </w:rPr>
+    </w:lvl>
+    <w:lvl w:ilvl="3" w:tentative="1">
+      <w:start w:val="1"/>
+      <w:numFmt w:val="bullet"/>
+      <w:lvlText w:val=""/>
+      <w:lvlJc w:val="left"/>
+      <w:pPr>
+        <w:tabs>
+          <w:tab w:val="num" w:pos="2880"/>
+        </w:tabs>
+        <w:ind w:left="2880" w:hanging="360"/>
+      </w:pPr>
+      <w:rPr>
+        <w:rFonts w:ascii="Wingdings" w:hAnsi="Wingdings" w:hint="default"/>
+        <w:sz w:val="20"/>
+      </w:rPr>
+    </w:lvl>
+    <w:lvl w:ilvl="4" w:tentative="1">
+      <w:start w:val="1"/>
+      <w:numFmt w:val="bullet"/>
+      <w:lvlText w:val=""/>
+      <w:lvlJc w:val="left"/>
+      <w:pPr>
+        <w:tabs>
+          <w:tab w:val="num" w:pos="3600"/>
+        </w:tabs>
+        <w:ind w:left="3600" w:hanging="360"/>
+      </w:pPr>
+      <w:rPr>
+        <w:rFonts w:ascii="Wingdings" w:hAnsi="Wingdings" w:hint="default"/>
+        <w:sz w:val="20"/>
+      </w:rPr>
+    </w:lvl>
+    <w:lvl w:ilvl="5" w:tentative="1">
+      <w:start w:val="1"/>
+      <w:numFmt w:val="bullet"/>
+      <w:lvlText w:val=""/>
+      <w:lvlJc w:val="left"/>
+      <w:pPr>
+        <w:tabs>
+          <w:tab w:val="num" w:pos="4320"/>
+        </w:tabs>
+        <w:ind w:left="4320" w:hanging="360"/>
+      </w:pPr>
+      <w:rPr>
+        <w:rFonts w:ascii="Wingdings" w:hAnsi="Wingdings" w:hint="default"/>
+        <w:sz w:val="20"/>
+      </w:rPr>
+    </w:lvl>
+    <w:lvl w:ilvl="6" w:tentative="1">
+      <w:start w:val="1"/>
+      <w:numFmt w:val="bullet"/>
+      <w:lvlText w:val=""/>
+      <w:lvlJc w:val="left"/>
+      <w:pPr>
+        <w:tabs>
+          <w:tab w:val="num" w:pos="5040"/>
+        </w:tabs>
+        <w:ind w:left="5040" w:hanging="360"/>
+      </w:pPr>
+      <w:rPr>
+        <w:rFonts w:ascii="Wingdings" w:hAnsi="Wingdings" w:hint="default"/>
+        <w:sz w:val="20"/>
+      </w:rPr>
+    </w:lvl>
+    <w:lvl w:ilvl="7" w:tentative="1">
+      <w:start w:val="1"/>
+      <w:numFmt w:val="bullet"/>
+      <w:lvlText w:val=""/>
+      <w:lvlJc w:val="left"/>
+      <w:pPr>
+        <w:tabs>
+          <w:tab w:val="num" w:pos="5760"/>
+        </w:tabs>
+        <w:ind w:left="5760" w:hanging="360"/>
+      </w:pPr>
+      <w:rPr>
+        <w:rFonts w:ascii="Wingdings" w:hAnsi="Wingdings" w:hint="default"/>
+        <w:sz w:val="20"/>
+      </w:rPr>
+    </w:lvl>
+    <w:lvl w:ilvl="8" w:tentative="1">
+      <w:start w:val="1"/>
+      <w:numFmt w:val="bullet"/>
+      <w:lvlText w:val=""/>
+      <w:lvlJc w:val="left"/>
+      <w:pPr>
+        <w:tabs>
+          <w:tab w:val="num" w:pos="6480"/>
+        </w:tabs>
+        <w:ind w:left="6480" w:hanging="360"/>
+      </w:pPr>
+      <w:rPr>
+        <w:rFonts w:ascii="Wingdings" w:hAnsi="Wingdings" w:hint="default"/>
+        <w:sz w:val="20"/>
+      </w:rPr>
+    </w:lvl>
+  </w:abstractNum>
+  <w:num w:numId="1" w16cid:durableId="1978945811">
+    <w:abstractNumId w:val="5"/>
+  </w:num>
+  <w:num w:numId="2" w16cid:durableId="1238049275">
+    <w:abstractNumId w:val="0"/>
+  </w:num>
+  <w:num w:numId="3" w16cid:durableId="1085492691">
+    <w:abstractNumId w:val="1"/>
+  </w:num>
+  <w:num w:numId="4" w16cid:durableId="776372018">
+    <w:abstractNumId w:val="4"/>
+  </w:num>
+  <w:num w:numId="5" w16cid:durableId="739668218">
+    <w:abstractNumId w:val="6"/>
+  </w:num>
+  <w:num w:numId="6" w16cid:durableId="1484850568">
+    <w:abstractNumId w:val="7"/>
+  </w:num>
+  <w:num w:numId="7" w16cid:durableId="316498941">
+    <w:abstractNumId w:val="3"/>
+  </w:num>
+  <w:num w:numId="8" w16cid:durableId="699165677">
+    <w:abstractNumId w:val="2"/>
+  </w:num>
+</w:numbering>
 </file>
 
 <file path=word/styles.xml><?xml version="1.0" encoding="utf-8"?>
@@ -490,6 +4111,7 @@
   <w:style w:type="paragraph" w:default="1" w:styleId="Normal">
     <w:name w:val="Normal"/>
     <w:qFormat/>
+    <w:rsid w:val="00BC1381"/>
   </w:style>
   <w:style w:type="paragraph" w:styleId="Heading1">
     <w:name w:val="heading 1"/>

</xml_diff>

<commit_message>
Java Records and Their Real-World Usage  #44
</commit_message>
<xml_diff>
--- a/Chapter4/Chapter4.docx
+++ b/Chapter4/Chapter4.docx
@@ -4359,6 +4359,172 @@
         <w:t>this(...) must always be the first statement inside a constructor.</w:t>
       </w:r>
     </w:p>
+    <w:p/>
+    <w:p>
+      <w:pPr>
+        <w:rPr>
+          <w:b/>
+          <w:bCs/>
+        </w:rPr>
+      </w:pPr>
+      <w:r>
+        <w:rPr>
+          <w:b/>
+          <w:bCs/>
+        </w:rPr>
+        <w:t>Initialization Blocks</w:t>
+      </w:r>
+    </w:p>
+    <w:p>
+      <w:r>
+        <w:t>is a block of code inside a class that runs whenever an object is created.</w:t>
+      </w:r>
+    </w:p>
+    <w:p>
+      <w:r>
+        <w:rPr>
+          <w:noProof/>
+        </w:rPr>
+        <w:drawing>
+          <wp:inline distT="0" distB="0" distL="0" distR="0" wp14:anchorId="36FC2234" wp14:editId="551A5015">
+            <wp:extent cx="6661150" cy="2767330"/>
+            <wp:effectExtent l="0" t="0" r="6350" b="0"/>
+            <wp:docPr id="1907352454" name="Picture 1"/>
+            <wp:cNvGraphicFramePr>
+              <a:graphicFrameLocks xmlns:a="http://schemas.openxmlformats.org/drawingml/2006/main" noChangeAspect="1"/>
+            </wp:cNvGraphicFramePr>
+            <a:graphic xmlns:a="http://schemas.openxmlformats.org/drawingml/2006/main">
+              <a:graphicData uri="http://schemas.openxmlformats.org/drawingml/2006/picture">
+                <pic:pic xmlns:pic="http://schemas.openxmlformats.org/drawingml/2006/picture">
+                  <pic:nvPicPr>
+                    <pic:cNvPr id="1907352454" name=""/>
+                    <pic:cNvPicPr/>
+                  </pic:nvPicPr>
+                  <pic:blipFill>
+                    <a:blip r:embed="rId28"/>
+                    <a:stretch>
+                      <a:fillRect/>
+                    </a:stretch>
+                  </pic:blipFill>
+                  <pic:spPr>
+                    <a:xfrm>
+                      <a:off x="0" y="0"/>
+                      <a:ext cx="6661150" cy="2767330"/>
+                    </a:xfrm>
+                    <a:prstGeom prst="rect">
+                      <a:avLst/>
+                    </a:prstGeom>
+                  </pic:spPr>
+                </pic:pic>
+              </a:graphicData>
+            </a:graphic>
+          </wp:inline>
+        </w:drawing>
+      </w:r>
+    </w:p>
+    <w:p>
+      <w:r>
+        <w:t>Initialization blocks are useful when multiple constructors share the same setup code.</w:t>
+      </w:r>
+    </w:p>
+    <w:p>
+      <w:pPr>
+        <w:rPr>
+          <w:b/>
+          <w:bCs/>
+        </w:rPr>
+      </w:pPr>
+      <w:r>
+        <w:rPr>
+          <w:b/>
+          <w:bCs/>
+        </w:rPr>
+        <w:t>Best Practice</w:t>
+      </w:r>
+    </w:p>
+    <w:p>
+      <w:r>
+        <w:t>Although valid, initialization blocks are less common. Many developers prefer constructors because the initialization logic is easier to find and understand.</w:t>
+      </w:r>
+    </w:p>
+    <w:p>
+      <w:r>
+        <w:t>Java supports instance initializer blocks as part of object initialization.</w:t>
+      </w:r>
+    </w:p>
+    <w:p/>
+    <w:p/>
+    <w:p>
+      <w:pPr>
+        <w:rPr>
+          <w:b/>
+          <w:bCs/>
+        </w:rPr>
+      </w:pPr>
+      <w:r>
+        <w:rPr>
+          <w:b/>
+          <w:bCs/>
+        </w:rPr>
+        <w:lastRenderedPageBreak/>
+        <w:t>Static Initialization Block</w:t>
+      </w:r>
+    </w:p>
+    <w:p>
+      <w:r>
+        <w:t>initializes static fields when the class is loaded.</w:t>
+      </w:r>
+    </w:p>
+    <w:p>
+      <w:pPr>
+        <w:rPr>
+          <w:b/>
+          <w:bCs/>
+        </w:rPr>
+      </w:pPr>
+      <w:r>
+        <w:rPr>
+          <w:b/>
+          <w:bCs/>
+        </w:rPr>
+        <w:t>Important Characteristics</w:t>
+      </w:r>
+    </w:p>
+    <w:p>
+      <w:pPr>
+        <w:numPr>
+          <w:ilvl w:val="0"/>
+          <w:numId w:val="17"/>
+        </w:numPr>
+      </w:pPr>
+      <w:r>
+        <w:t xml:space="preserve">Runs only once. </w:t>
+      </w:r>
+    </w:p>
+    <w:p>
+      <w:pPr>
+        <w:numPr>
+          <w:ilvl w:val="0"/>
+          <w:numId w:val="17"/>
+        </w:numPr>
+      </w:pPr>
+      <w:r>
+        <w:t xml:space="preserve">Runs when the class is loaded. </w:t>
+      </w:r>
+    </w:p>
+    <w:p>
+      <w:pPr>
+        <w:numPr>
+          <w:ilvl w:val="0"/>
+          <w:numId w:val="17"/>
+        </w:numPr>
+      </w:pPr>
+      <w:r>
+        <w:t>Initializes class-level data.</w:t>
+      </w:r>
+    </w:p>
+    <w:p/>
+    <w:p/>
     <w:sectPr>
       <w:pgSz w:w="11906" w:h="16838"/>
       <w:pgMar w:top="567" w:right="707" w:bottom="709" w:left="709" w:header="708" w:footer="708" w:gutter="0"/>
@@ -4670,6 +4836,155 @@
     </w:lvl>
   </w:abstractNum>
   <w:abstractNum w:abstractNumId="2" w15:restartNumberingAfterBreak="0">
+    <w:nsid w:val="0CCE7A55"/>
+    <w:multiLevelType w:val="multilevel"/>
+    <w:tmpl w:val="AC86FD02"/>
+    <w:lvl w:ilvl="0">
+      <w:start w:val="1"/>
+      <w:numFmt w:val="bullet"/>
+      <w:lvlText w:val=""/>
+      <w:lvlJc w:val="left"/>
+      <w:pPr>
+        <w:tabs>
+          <w:tab w:val="num" w:pos="720"/>
+        </w:tabs>
+        <w:ind w:left="720" w:hanging="360"/>
+      </w:pPr>
+      <w:rPr>
+        <w:rFonts w:ascii="Symbol" w:hAnsi="Symbol" w:hint="default"/>
+        <w:sz w:val="20"/>
+      </w:rPr>
+    </w:lvl>
+    <w:lvl w:ilvl="1" w:tentative="1">
+      <w:start w:val="1"/>
+      <w:numFmt w:val="bullet"/>
+      <w:lvlText w:val="o"/>
+      <w:lvlJc w:val="left"/>
+      <w:pPr>
+        <w:tabs>
+          <w:tab w:val="num" w:pos="1440"/>
+        </w:tabs>
+        <w:ind w:left="1440" w:hanging="360"/>
+      </w:pPr>
+      <w:rPr>
+        <w:rFonts w:ascii="Courier New" w:hAnsi="Courier New" w:hint="default"/>
+        <w:sz w:val="20"/>
+      </w:rPr>
+    </w:lvl>
+    <w:lvl w:ilvl="2" w:tentative="1">
+      <w:start w:val="1"/>
+      <w:numFmt w:val="bullet"/>
+      <w:lvlText w:val=""/>
+      <w:lvlJc w:val="left"/>
+      <w:pPr>
+        <w:tabs>
+          <w:tab w:val="num" w:pos="2160"/>
+        </w:tabs>
+        <w:ind w:left="2160" w:hanging="360"/>
+      </w:pPr>
+      <w:rPr>
+        <w:rFonts w:ascii="Wingdings" w:hAnsi="Wingdings" w:hint="default"/>
+        <w:sz w:val="20"/>
+      </w:rPr>
+    </w:lvl>
+    <w:lvl w:ilvl="3" w:tentative="1">
+      <w:start w:val="1"/>
+      <w:numFmt w:val="bullet"/>
+      <w:lvlText w:val=""/>
+      <w:lvlJc w:val="left"/>
+      <w:pPr>
+        <w:tabs>
+          <w:tab w:val="num" w:pos="2880"/>
+        </w:tabs>
+        <w:ind w:left="2880" w:hanging="360"/>
+      </w:pPr>
+      <w:rPr>
+        <w:rFonts w:ascii="Wingdings" w:hAnsi="Wingdings" w:hint="default"/>
+        <w:sz w:val="20"/>
+      </w:rPr>
+    </w:lvl>
+    <w:lvl w:ilvl="4" w:tentative="1">
+      <w:start w:val="1"/>
+      <w:numFmt w:val="bullet"/>
+      <w:lvlText w:val=""/>
+      <w:lvlJc w:val="left"/>
+      <w:pPr>
+        <w:tabs>
+          <w:tab w:val="num" w:pos="3600"/>
+        </w:tabs>
+        <w:ind w:left="3600" w:hanging="360"/>
+      </w:pPr>
+      <w:rPr>
+        <w:rFonts w:ascii="Wingdings" w:hAnsi="Wingdings" w:hint="default"/>
+        <w:sz w:val="20"/>
+      </w:rPr>
+    </w:lvl>
+    <w:lvl w:ilvl="5" w:tentative="1">
+      <w:start w:val="1"/>
+      <w:numFmt w:val="bullet"/>
+      <w:lvlText w:val=""/>
+      <w:lvlJc w:val="left"/>
+      <w:pPr>
+        <w:tabs>
+          <w:tab w:val="num" w:pos="4320"/>
+        </w:tabs>
+        <w:ind w:left="4320" w:hanging="360"/>
+      </w:pPr>
+      <w:rPr>
+        <w:rFonts w:ascii="Wingdings" w:hAnsi="Wingdings" w:hint="default"/>
+        <w:sz w:val="20"/>
+      </w:rPr>
+    </w:lvl>
+    <w:lvl w:ilvl="6" w:tentative="1">
+      <w:start w:val="1"/>
+      <w:numFmt w:val="bullet"/>
+      <w:lvlText w:val=""/>
+      <w:lvlJc w:val="left"/>
+      <w:pPr>
+        <w:tabs>
+          <w:tab w:val="num" w:pos="5040"/>
+        </w:tabs>
+        <w:ind w:left="5040" w:hanging="360"/>
+      </w:pPr>
+      <w:rPr>
+        <w:rFonts w:ascii="Wingdings" w:hAnsi="Wingdings" w:hint="default"/>
+        <w:sz w:val="20"/>
+      </w:rPr>
+    </w:lvl>
+    <w:lvl w:ilvl="7" w:tentative="1">
+      <w:start w:val="1"/>
+      <w:numFmt w:val="bullet"/>
+      <w:lvlText w:val=""/>
+      <w:lvlJc w:val="left"/>
+      <w:pPr>
+        <w:tabs>
+          <w:tab w:val="num" w:pos="5760"/>
+        </w:tabs>
+        <w:ind w:left="5760" w:hanging="360"/>
+      </w:pPr>
+      <w:rPr>
+        <w:rFonts w:ascii="Wingdings" w:hAnsi="Wingdings" w:hint="default"/>
+        <w:sz w:val="20"/>
+      </w:rPr>
+    </w:lvl>
+    <w:lvl w:ilvl="8" w:tentative="1">
+      <w:start w:val="1"/>
+      <w:numFmt w:val="bullet"/>
+      <w:lvlText w:val=""/>
+      <w:lvlJc w:val="left"/>
+      <w:pPr>
+        <w:tabs>
+          <w:tab w:val="num" w:pos="6480"/>
+        </w:tabs>
+        <w:ind w:left="6480" w:hanging="360"/>
+      </w:pPr>
+      <w:rPr>
+        <w:rFonts w:ascii="Wingdings" w:hAnsi="Wingdings" w:hint="default"/>
+        <w:sz w:val="20"/>
+      </w:rPr>
+    </w:lvl>
+  </w:abstractNum>
+  <w:abstractNum w:abstractNumId="3" w15:restartNumberingAfterBreak="0">
     <w:nsid w:val="0E047077"/>
     <w:multiLevelType w:val="multilevel"/>
     <w:tmpl w:val="9BD4B0B4"/>
@@ -4782,7 +5097,7 @@
       </w:pPr>
     </w:lvl>
   </w:abstractNum>
-  <w:abstractNum w:abstractNumId="3" w15:restartNumberingAfterBreak="0">
+  <w:abstractNum w:abstractNumId="4" w15:restartNumberingAfterBreak="0">
     <w:nsid w:val="113959A4"/>
     <w:multiLevelType w:val="multilevel"/>
     <w:tmpl w:val="850CC308"/>
@@ -4931,7 +5246,7 @@
       </w:rPr>
     </w:lvl>
   </w:abstractNum>
-  <w:abstractNum w:abstractNumId="4" w15:restartNumberingAfterBreak="0">
+  <w:abstractNum w:abstractNumId="5" w15:restartNumberingAfterBreak="0">
     <w:nsid w:val="260950E5"/>
     <w:multiLevelType w:val="multilevel"/>
     <w:tmpl w:val="53F0A9FA"/>
@@ -5080,7 +5395,7 @@
       </w:rPr>
     </w:lvl>
   </w:abstractNum>
-  <w:abstractNum w:abstractNumId="5" w15:restartNumberingAfterBreak="0">
+  <w:abstractNum w:abstractNumId="6" w15:restartNumberingAfterBreak="0">
     <w:nsid w:val="2D083C72"/>
     <w:multiLevelType w:val="multilevel"/>
     <w:tmpl w:val="4ADAEF00"/>
@@ -5229,7 +5544,7 @@
       </w:rPr>
     </w:lvl>
   </w:abstractNum>
-  <w:abstractNum w:abstractNumId="6" w15:restartNumberingAfterBreak="0">
+  <w:abstractNum w:abstractNumId="7" w15:restartNumberingAfterBreak="0">
     <w:nsid w:val="38BE17C3"/>
     <w:multiLevelType w:val="multilevel"/>
     <w:tmpl w:val="9312B01A"/>
@@ -5342,7 +5657,7 @@
       </w:pPr>
     </w:lvl>
   </w:abstractNum>
-  <w:abstractNum w:abstractNumId="7" w15:restartNumberingAfterBreak="0">
+  <w:abstractNum w:abstractNumId="8" w15:restartNumberingAfterBreak="0">
     <w:nsid w:val="3F137A4D"/>
     <w:multiLevelType w:val="multilevel"/>
     <w:tmpl w:val="7326D258"/>
@@ -5491,7 +5806,7 @@
       </w:rPr>
     </w:lvl>
   </w:abstractNum>
-  <w:abstractNum w:abstractNumId="8" w15:restartNumberingAfterBreak="0">
+  <w:abstractNum w:abstractNumId="9" w15:restartNumberingAfterBreak="0">
     <w:nsid w:val="5804509C"/>
     <w:multiLevelType w:val="multilevel"/>
     <w:tmpl w:val="7C5A0912"/>
@@ -5640,7 +5955,7 @@
       </w:rPr>
     </w:lvl>
   </w:abstractNum>
-  <w:abstractNum w:abstractNumId="9" w15:restartNumberingAfterBreak="0">
+  <w:abstractNum w:abstractNumId="10" w15:restartNumberingAfterBreak="0">
     <w:nsid w:val="5AAB25B5"/>
     <w:multiLevelType w:val="multilevel"/>
     <w:tmpl w:val="7236F5CA"/>
@@ -5789,7 +6104,7 @@
       </w:rPr>
     </w:lvl>
   </w:abstractNum>
-  <w:abstractNum w:abstractNumId="10" w15:restartNumberingAfterBreak="0">
+  <w:abstractNum w:abstractNumId="11" w15:restartNumberingAfterBreak="0">
     <w:nsid w:val="5AB65165"/>
     <w:multiLevelType w:val="multilevel"/>
     <w:tmpl w:val="B622C924"/>
@@ -5938,7 +6253,7 @@
       </w:rPr>
     </w:lvl>
   </w:abstractNum>
-  <w:abstractNum w:abstractNumId="11" w15:restartNumberingAfterBreak="0">
+  <w:abstractNum w:abstractNumId="12" w15:restartNumberingAfterBreak="0">
     <w:nsid w:val="5F3538FB"/>
     <w:multiLevelType w:val="multilevel"/>
     <w:tmpl w:val="57F242BA"/>
@@ -6087,7 +6402,7 @@
       </w:rPr>
     </w:lvl>
   </w:abstractNum>
-  <w:abstractNum w:abstractNumId="12" w15:restartNumberingAfterBreak="0">
+  <w:abstractNum w:abstractNumId="13" w15:restartNumberingAfterBreak="0">
     <w:nsid w:val="5F3C5130"/>
     <w:multiLevelType w:val="multilevel"/>
     <w:tmpl w:val="DC9AA11C"/>
@@ -6236,7 +6551,7 @@
       </w:rPr>
     </w:lvl>
   </w:abstractNum>
-  <w:abstractNum w:abstractNumId="13" w15:restartNumberingAfterBreak="0">
+  <w:abstractNum w:abstractNumId="14" w15:restartNumberingAfterBreak="0">
     <w:nsid w:val="5FA516A7"/>
     <w:multiLevelType w:val="multilevel"/>
     <w:tmpl w:val="63D2FA0A"/>
@@ -6385,7 +6700,7 @@
       </w:rPr>
     </w:lvl>
   </w:abstractNum>
-  <w:abstractNum w:abstractNumId="14" w15:restartNumberingAfterBreak="0">
+  <w:abstractNum w:abstractNumId="15" w15:restartNumberingAfterBreak="0">
     <w:nsid w:val="6DB757D9"/>
     <w:multiLevelType w:val="multilevel"/>
     <w:tmpl w:val="EB68BC68"/>
@@ -6534,7 +6849,7 @@
       </w:rPr>
     </w:lvl>
   </w:abstractNum>
-  <w:abstractNum w:abstractNumId="15" w15:restartNumberingAfterBreak="0">
+  <w:abstractNum w:abstractNumId="16" w15:restartNumberingAfterBreak="0">
     <w:nsid w:val="72B12E7D"/>
     <w:multiLevelType w:val="multilevel"/>
     <w:tmpl w:val="55BEC34C"/>
@@ -6684,52 +6999,55 @@
     </w:lvl>
   </w:abstractNum>
   <w:num w:numId="1" w16cid:durableId="1978945811">
-    <w:abstractNumId w:val="9"/>
+    <w:abstractNumId w:val="10"/>
   </w:num>
   <w:num w:numId="2" w16cid:durableId="1238049275">
     <w:abstractNumId w:val="0"/>
   </w:num>
   <w:num w:numId="3" w16cid:durableId="1085492691">
-    <w:abstractNumId w:val="3"/>
+    <w:abstractNumId w:val="4"/>
   </w:num>
   <w:num w:numId="4" w16cid:durableId="776372018">
+    <w:abstractNumId w:val="9"/>
+  </w:num>
+  <w:num w:numId="5" w16cid:durableId="739668218">
+    <w:abstractNumId w:val="13"/>
+  </w:num>
+  <w:num w:numId="6" w16cid:durableId="1484850568">
+    <w:abstractNumId w:val="16"/>
+  </w:num>
+  <w:num w:numId="7" w16cid:durableId="316498941">
     <w:abstractNumId w:val="8"/>
   </w:num>
-  <w:num w:numId="5" w16cid:durableId="739668218">
-    <w:abstractNumId w:val="12"/>
-  </w:num>
-  <w:num w:numId="6" w16cid:durableId="1484850568">
-    <w:abstractNumId w:val="15"/>
-  </w:num>
-  <w:num w:numId="7" w16cid:durableId="316498941">
-    <w:abstractNumId w:val="7"/>
-  </w:num>
   <w:num w:numId="8" w16cid:durableId="699165677">
-    <w:abstractNumId w:val="5"/>
+    <w:abstractNumId w:val="6"/>
   </w:num>
   <w:num w:numId="9" w16cid:durableId="2016688739">
     <w:abstractNumId w:val="1"/>
   </w:num>
   <w:num w:numId="10" w16cid:durableId="1198927766">
+    <w:abstractNumId w:val="15"/>
+  </w:num>
+  <w:num w:numId="11" w16cid:durableId="694581721">
+    <w:abstractNumId w:val="7"/>
+  </w:num>
+  <w:num w:numId="12" w16cid:durableId="2022395361">
     <w:abstractNumId w:val="14"/>
   </w:num>
-  <w:num w:numId="11" w16cid:durableId="694581721">
-    <w:abstractNumId w:val="6"/>
-  </w:num>
-  <w:num w:numId="12" w16cid:durableId="2022395361">
-    <w:abstractNumId w:val="13"/>
-  </w:num>
   <w:num w:numId="13" w16cid:durableId="813371540">
-    <w:abstractNumId w:val="2"/>
+    <w:abstractNumId w:val="3"/>
   </w:num>
   <w:num w:numId="14" w16cid:durableId="2141418436">
-    <w:abstractNumId w:val="10"/>
+    <w:abstractNumId w:val="11"/>
   </w:num>
   <w:num w:numId="15" w16cid:durableId="319238780">
-    <w:abstractNumId w:val="11"/>
+    <w:abstractNumId w:val="12"/>
   </w:num>
   <w:num w:numId="16" w16cid:durableId="831874346">
-    <w:abstractNumId w:val="4"/>
+    <w:abstractNumId w:val="5"/>
+  </w:num>
+  <w:num w:numId="17" w16cid:durableId="2077241956">
+    <w:abstractNumId w:val="2"/>
   </w:num>
 </w:numbering>
 </file>

</xml_diff>